<commit_message>
Kiểm tra hoàn thành phần Mở đầu & Chương1
</commit_message>
<xml_diff>
--- a/BaoCaoCuoiCung.docx
+++ b/BaoCaoCuoiCung.docx
@@ -20,13 +20,13 @@
           <w:szCs w:val="26"/>
         </w:rPr>
         <w:drawing>
-          <wp:anchor distT="0" distB="0" distL="114300" distR="114300" simplePos="0" relativeHeight="251660288" behindDoc="1" locked="0" layoutInCell="1" allowOverlap="1" wp14:anchorId="6C60AB65" wp14:editId="26E3A228">
+          <wp:anchor distT="0" distB="0" distL="114300" distR="114300" simplePos="0" relativeHeight="251659264" behindDoc="1" locked="0" layoutInCell="1" allowOverlap="1" wp14:anchorId="29E90142" wp14:editId="6AE1FBA5">
             <wp:simplePos x="0" y="0"/>
             <wp:positionH relativeFrom="column">
-              <wp:posOffset>-192490</wp:posOffset>
+              <wp:posOffset>-192405</wp:posOffset>
             </wp:positionH>
             <wp:positionV relativeFrom="paragraph">
-              <wp:posOffset>-492741</wp:posOffset>
+              <wp:posOffset>-492125</wp:posOffset>
             </wp:positionV>
             <wp:extent cx="6108065" cy="9923780"/>
             <wp:effectExtent l="19050" t="19050" r="26035" b="20320"/>
@@ -164,8 +164,8 @@
           <w:noProof/>
         </w:rPr>
         <w:drawing>
-          <wp:inline distT="0" distB="0" distL="0" distR="0" wp14:anchorId="6C57C303" wp14:editId="58DAC1F4">
-            <wp:extent cx="4080680" cy="933354"/>
+          <wp:inline distT="0" distB="0" distL="0" distR="0" wp14:anchorId="7A7FCB65" wp14:editId="13AAD59C">
+            <wp:extent cx="4080510" cy="932815"/>
             <wp:effectExtent l="0" t="0" r="0" b="635"/>
             <wp:docPr id="3" name="Picture 3"/>
             <wp:cNvGraphicFramePr>
@@ -176,9 +176,11 @@
                 <pic:pic xmlns:pic="http://schemas.openxmlformats.org/drawingml/2006/picture">
                   <pic:nvPicPr>
                     <pic:cNvPr id="3" name="Picture 3"/>
-                    <pic:cNvPicPr/>
+                    <pic:cNvPicPr>
+                      <a:picLocks noChangeAspect="1"/>
+                    </pic:cNvPicPr>
                   </pic:nvPicPr>
-                  <pic:blipFill rotWithShape="1">
+                  <pic:blipFill>
                     <a:blip r:embed="rId9">
                       <a:extLst>
                         <a:ext uri="{28A0092B-C50C-407E-A947-70E740481C1C}">
@@ -187,9 +189,11 @@
                       </a:extLst>
                     </a:blip>
                     <a:srcRect l="1774" t="-1462" r="1764" b="1462"/>
-                    <a:stretch/>
+                    <a:stretch>
+                      <a:fillRect/>
+                    </a:stretch>
                   </pic:blipFill>
-                  <pic:spPr bwMode="auto">
+                  <pic:spPr>
                     <a:xfrm>
                       <a:off x="0" y="0"/>
                       <a:ext cx="4081919" cy="933637"/>
@@ -200,11 +204,6 @@
                     <a:ln>
                       <a:noFill/>
                     </a:ln>
-                    <a:extLst>
-                      <a:ext uri="{53640926-AAD7-44D8-BBD7-CCE9431645EC}">
-                        <a14:shadowObscured xmlns:a14="http://schemas.microsoft.com/office/drawing/2010/main"/>
-                      </a:ext>
-                    </a:extLst>
                   </pic:spPr>
                 </pic:pic>
               </a:graphicData>
@@ -248,6 +247,7 @@
           <w:szCs w:val="28"/>
         </w:rPr>
       </w:pPr>
+      <w:bookmarkStart w:id="0" w:name="_Hlk243244084"/>
       <w:r>
         <w:rPr>
           <w:rFonts w:cs="Times New Roman"/>
@@ -259,6 +259,7 @@
         <w:t>KHẢO SÁT CÁC GIẢI PHÁP GIẢM ÙN TẮC GIAO THÔNG</w:t>
       </w:r>
     </w:p>
+    <w:bookmarkEnd w:id="0"/>
     <w:p>
       <w:pPr>
         <w:spacing w:after="0" w:line="240" w:lineRule="auto"/>
@@ -930,7 +931,6 @@
         <w:rPr>
           <w:rFonts w:eastAsia="Times New Roman" w:cs="Times New Roman"/>
           <w:b/>
-          <w:noProof/>
           <w:szCs w:val="26"/>
         </w:rPr>
       </w:pPr>
@@ -940,43 +940,9 @@
           <w:b/>
           <w:i/>
           <w:iCs/>
-          <w:noProof/>
           <w:szCs w:val="26"/>
         </w:rPr>
-        <w:t>Thành phố</w:t>
-      </w:r>
-      <w:r>
-        <w:rPr>
-          <w:rFonts w:eastAsia="Times New Roman" w:cs="Times New Roman"/>
-          <w:b/>
-          <w:i/>
-          <w:iCs/>
-          <w:noProof/>
-          <w:szCs w:val="26"/>
-        </w:rPr>
-        <w:t xml:space="preserve"> </w:t>
-      </w:r>
-      <w:r>
-        <w:rPr>
-          <w:rFonts w:eastAsia="Times New Roman" w:cs="Times New Roman"/>
-          <w:b/>
-          <w:i/>
-          <w:iCs/>
-          <w:noProof/>
-          <w:szCs w:val="26"/>
-        </w:rPr>
-        <w:t>Hồ Chí Minh, tháng  năm 202</w:t>
-      </w:r>
-      <w:r>
-        <w:rPr>
-          <w:rFonts w:eastAsia="Times New Roman" w:cs="Times New Roman"/>
-          <w:b/>
-          <w:i/>
-          <w:iCs/>
-          <w:noProof/>
-          <w:szCs w:val="26"/>
-        </w:rPr>
-        <w:t>6</w:t>
+        <w:t>Thành phố Hồ Chí Minh, tháng  năm 2026</w:t>
       </w:r>
     </w:p>
     <w:p>
@@ -1003,8 +969,10 @@
     <w:sdt>
       <w:sdtPr>
         <w:rPr>
-          <w:rFonts w:ascii="Times New Roman" w:hAnsi="Times New Roman" w:cs="Times New Roman"/>
+          <w:rFonts w:ascii="Times New Roman" w:eastAsiaTheme="minorEastAsia" w:hAnsi="Times New Roman" w:cs="Times New Roman"/>
           <w:color w:val="auto"/>
+          <w:sz w:val="26"/>
+          <w:szCs w:val="22"/>
         </w:rPr>
         <w:id w:val="-1796663005"/>
         <w:docPartObj>
@@ -1014,18 +982,14 @@
       </w:sdtPr>
       <w:sdtEndPr>
         <w:rPr>
-          <w:rFonts w:eastAsiaTheme="minorEastAsia"/>
-          <w:b/>
-          <w:bCs/>
-          <w:noProof/>
-          <w:sz w:val="26"/>
-          <w:szCs w:val="22"/>
+          <w:b/>
+          <w:bCs/>
         </w:rPr>
       </w:sdtEndPr>
       <w:sdtContent>
         <w:p>
           <w:pPr>
-            <w:pStyle w:val="TOCHeading"/>
+            <w:pStyle w:val="TOCHeading1"/>
             <w:jc w:val="center"/>
             <w:rPr>
               <w:rFonts w:ascii="Times New Roman" w:hAnsi="Times New Roman" w:cs="Times New Roman"/>
@@ -1052,7 +1016,6 @@
             </w:tabs>
             <w:rPr>
               <w:rFonts w:cs="Times New Roman"/>
-              <w:noProof/>
               <w:kern w:val="2"/>
               <w:sz w:val="24"/>
               <w:szCs w:val="24"/>
@@ -1082,7 +1045,6 @@
               <w:rPr>
                 <w:rStyle w:val="Hyperlink"/>
                 <w:rFonts w:cs="Times New Roman"/>
-                <w:noProof/>
                 <w:color w:val="auto"/>
               </w:rPr>
               <w:t>DANH MỤC TỪ VIẾT TẮT</w:t>
@@ -1090,55 +1052,41 @@
             <w:r>
               <w:rPr>
                 <w:rFonts w:cs="Times New Roman"/>
-                <w:noProof/>
-                <w:webHidden/>
               </w:rPr>
               <w:tab/>
             </w:r>
             <w:r>
               <w:rPr>
                 <w:rFonts w:cs="Times New Roman"/>
-                <w:noProof/>
-                <w:webHidden/>
               </w:rPr>
               <w:fldChar w:fldCharType="begin"/>
             </w:r>
             <w:r>
               <w:rPr>
                 <w:rFonts w:cs="Times New Roman"/>
-                <w:noProof/>
-                <w:webHidden/>
               </w:rPr>
               <w:instrText xml:space="preserve"> PAGEREF _Toc242610722 \h </w:instrText>
             </w:r>
             <w:r>
               <w:rPr>
                 <w:rFonts w:cs="Times New Roman"/>
-                <w:noProof/>
-                <w:webHidden/>
               </w:rPr>
             </w:r>
             <w:r>
               <w:rPr>
                 <w:rFonts w:cs="Times New Roman"/>
-                <w:noProof/>
-                <w:webHidden/>
               </w:rPr>
               <w:fldChar w:fldCharType="separate"/>
             </w:r>
             <w:r>
               <w:rPr>
                 <w:rFonts w:cs="Times New Roman"/>
-                <w:noProof/>
-                <w:webHidden/>
               </w:rPr>
               <w:t>3</w:t>
             </w:r>
             <w:r>
               <w:rPr>
                 <w:rFonts w:cs="Times New Roman"/>
-                <w:noProof/>
-                <w:webHidden/>
               </w:rPr>
               <w:fldChar w:fldCharType="end"/>
             </w:r>
@@ -1152,7 +1100,6 @@
             </w:tabs>
             <w:rPr>
               <w:rFonts w:cs="Times New Roman"/>
-              <w:noProof/>
               <w:kern w:val="2"/>
               <w:sz w:val="24"/>
               <w:szCs w:val="24"/>
@@ -1164,7 +1111,6 @@
               <w:rPr>
                 <w:rStyle w:val="Hyperlink"/>
                 <w:rFonts w:cs="Times New Roman"/>
-                <w:noProof/>
                 <w:color w:val="auto"/>
               </w:rPr>
               <w:t>MỤC LỤC HÌNH ẢNH</w:t>
@@ -1172,55 +1118,41 @@
             <w:r>
               <w:rPr>
                 <w:rFonts w:cs="Times New Roman"/>
-                <w:noProof/>
-                <w:webHidden/>
               </w:rPr>
               <w:tab/>
             </w:r>
             <w:r>
               <w:rPr>
                 <w:rFonts w:cs="Times New Roman"/>
-                <w:noProof/>
-                <w:webHidden/>
               </w:rPr>
               <w:fldChar w:fldCharType="begin"/>
             </w:r>
             <w:r>
               <w:rPr>
                 <w:rFonts w:cs="Times New Roman"/>
-                <w:noProof/>
-                <w:webHidden/>
               </w:rPr>
               <w:instrText xml:space="preserve"> PAGEREF _Toc242610723 \h </w:instrText>
             </w:r>
             <w:r>
               <w:rPr>
                 <w:rFonts w:cs="Times New Roman"/>
-                <w:noProof/>
-                <w:webHidden/>
               </w:rPr>
             </w:r>
             <w:r>
               <w:rPr>
                 <w:rFonts w:cs="Times New Roman"/>
-                <w:noProof/>
-                <w:webHidden/>
               </w:rPr>
               <w:fldChar w:fldCharType="separate"/>
             </w:r>
             <w:r>
               <w:rPr>
                 <w:rFonts w:cs="Times New Roman"/>
-                <w:noProof/>
-                <w:webHidden/>
               </w:rPr>
               <w:t>4</w:t>
             </w:r>
             <w:r>
               <w:rPr>
                 <w:rFonts w:cs="Times New Roman"/>
-                <w:noProof/>
-                <w:webHidden/>
               </w:rPr>
               <w:fldChar w:fldCharType="end"/>
             </w:r>
@@ -1234,7 +1166,6 @@
             </w:tabs>
             <w:rPr>
               <w:rFonts w:cs="Times New Roman"/>
-              <w:noProof/>
               <w:kern w:val="2"/>
               <w:sz w:val="24"/>
               <w:szCs w:val="24"/>
@@ -1246,7 +1177,6 @@
               <w:rPr>
                 <w:rStyle w:val="Hyperlink"/>
                 <w:rFonts w:cs="Times New Roman"/>
-                <w:noProof/>
                 <w:color w:val="auto"/>
               </w:rPr>
               <w:t>LỜI CẢM ƠN</w:t>
@@ -1254,55 +1184,41 @@
             <w:r>
               <w:rPr>
                 <w:rFonts w:cs="Times New Roman"/>
-                <w:noProof/>
-                <w:webHidden/>
               </w:rPr>
               <w:tab/>
             </w:r>
             <w:r>
               <w:rPr>
                 <w:rFonts w:cs="Times New Roman"/>
-                <w:noProof/>
-                <w:webHidden/>
               </w:rPr>
               <w:fldChar w:fldCharType="begin"/>
             </w:r>
             <w:r>
               <w:rPr>
                 <w:rFonts w:cs="Times New Roman"/>
-                <w:noProof/>
-                <w:webHidden/>
               </w:rPr>
               <w:instrText xml:space="preserve"> PAGEREF _Toc242610724 \h </w:instrText>
             </w:r>
             <w:r>
               <w:rPr>
                 <w:rFonts w:cs="Times New Roman"/>
-                <w:noProof/>
-                <w:webHidden/>
               </w:rPr>
             </w:r>
             <w:r>
               <w:rPr>
                 <w:rFonts w:cs="Times New Roman"/>
-                <w:noProof/>
-                <w:webHidden/>
               </w:rPr>
               <w:fldChar w:fldCharType="separate"/>
             </w:r>
             <w:r>
               <w:rPr>
                 <w:rFonts w:cs="Times New Roman"/>
-                <w:noProof/>
-                <w:webHidden/>
               </w:rPr>
               <w:t>5</w:t>
             </w:r>
             <w:r>
               <w:rPr>
                 <w:rFonts w:cs="Times New Roman"/>
-                <w:noProof/>
-                <w:webHidden/>
               </w:rPr>
               <w:fldChar w:fldCharType="end"/>
             </w:r>
@@ -1316,7 +1232,6 @@
             </w:tabs>
             <w:rPr>
               <w:rFonts w:cs="Times New Roman"/>
-              <w:noProof/>
               <w:kern w:val="2"/>
               <w:sz w:val="24"/>
               <w:szCs w:val="24"/>
@@ -1328,7 +1243,6 @@
               <w:rPr>
                 <w:rStyle w:val="Hyperlink"/>
                 <w:rFonts w:cs="Times New Roman"/>
-                <w:noProof/>
                 <w:color w:val="auto"/>
               </w:rPr>
               <w:t>LỜI MỞ ĐẦU</w:t>
@@ -1336,55 +1250,41 @@
             <w:r>
               <w:rPr>
                 <w:rFonts w:cs="Times New Roman"/>
-                <w:noProof/>
-                <w:webHidden/>
               </w:rPr>
               <w:tab/>
             </w:r>
             <w:r>
               <w:rPr>
                 <w:rFonts w:cs="Times New Roman"/>
-                <w:noProof/>
-                <w:webHidden/>
               </w:rPr>
               <w:fldChar w:fldCharType="begin"/>
             </w:r>
             <w:r>
               <w:rPr>
                 <w:rFonts w:cs="Times New Roman"/>
-                <w:noProof/>
-                <w:webHidden/>
               </w:rPr>
               <w:instrText xml:space="preserve"> PAGEREF _Toc242610725 \h </w:instrText>
             </w:r>
             <w:r>
               <w:rPr>
                 <w:rFonts w:cs="Times New Roman"/>
-                <w:noProof/>
-                <w:webHidden/>
               </w:rPr>
             </w:r>
             <w:r>
               <w:rPr>
                 <w:rFonts w:cs="Times New Roman"/>
-                <w:noProof/>
-                <w:webHidden/>
               </w:rPr>
               <w:fldChar w:fldCharType="separate"/>
             </w:r>
             <w:r>
               <w:rPr>
                 <w:rFonts w:cs="Times New Roman"/>
-                <w:noProof/>
-                <w:webHidden/>
               </w:rPr>
               <w:t>6</w:t>
             </w:r>
             <w:r>
               <w:rPr>
                 <w:rFonts w:cs="Times New Roman"/>
-                <w:noProof/>
-                <w:webHidden/>
               </w:rPr>
               <w:fldChar w:fldCharType="end"/>
             </w:r>
@@ -1401,7 +1301,6 @@
               <w:rFonts w:cs="Times New Roman"/>
               <w:b/>
               <w:bCs/>
-              <w:noProof/>
             </w:rPr>
             <w:fldChar w:fldCharType="end"/>
           </w:r>
@@ -1435,7 +1334,7 @@
           <w:szCs w:val="32"/>
         </w:rPr>
       </w:pPr>
-      <w:bookmarkStart w:id="0" w:name="_Toc242610722"/>
+      <w:bookmarkStart w:id="1" w:name="_Toc242610722"/>
       <w:r>
         <w:rPr>
           <w:rFonts w:ascii="Times New Roman" w:hAnsi="Times New Roman" w:cs="Times New Roman"/>
@@ -1448,11 +1347,11 @@
         <w:lastRenderedPageBreak/>
         <w:t>DANH MỤC TỪ VIẾT TẮT</w:t>
       </w:r>
-      <w:bookmarkEnd w:id="0"/>
+      <w:bookmarkEnd w:id="1"/>
     </w:p>
     <w:tbl>
       <w:tblPr>
-        <w:tblStyle w:val="TableGridLight"/>
+        <w:tblStyle w:val="TableGridLight1"/>
         <w:tblW w:w="0" w:type="auto"/>
         <w:tblLook w:val="04A0" w:firstRow="1" w:lastRow="0" w:firstColumn="1" w:lastColumn="0" w:noHBand="0" w:noVBand="1"/>
       </w:tblPr>
@@ -1554,6 +1453,14 @@
                 <w:bCs/>
               </w:rPr>
             </w:pPr>
+            <w:r>
+              <w:rPr>
+                <w:rFonts w:cs="Times New Roman"/>
+                <w:sz w:val="28"/>
+                <w:szCs w:val="28"/>
+              </w:rPr>
+              <w:t>ITS</w:t>
+            </w:r>
           </w:p>
         </w:tc>
         <w:tc>
@@ -1607,6 +1514,14 @@
                 <w:bCs/>
               </w:rPr>
             </w:pPr>
+            <w:r>
+              <w:rPr>
+                <w:rFonts w:cs="Times New Roman"/>
+                <w:sz w:val="28"/>
+                <w:szCs w:val="28"/>
+              </w:rPr>
+              <w:t>AI</w:t>
+            </w:r>
           </w:p>
         </w:tc>
         <w:tc>
@@ -1678,7 +1593,7 @@
           <w:szCs w:val="32"/>
         </w:rPr>
       </w:pPr>
-      <w:bookmarkStart w:id="1" w:name="_Toc242610723"/>
+      <w:bookmarkStart w:id="2" w:name="_Toc242610723"/>
       <w:r>
         <w:rPr>
           <w:rFonts w:ascii="Times New Roman" w:hAnsi="Times New Roman" w:cs="Times New Roman"/>
@@ -1691,7 +1606,7 @@
         <w:lastRenderedPageBreak/>
         <w:t>MỤC LỤC HÌNH ẢNH</w:t>
       </w:r>
-      <w:bookmarkEnd w:id="1"/>
+      <w:bookmarkEnd w:id="2"/>
     </w:p>
     <w:p>
       <w:pPr>
@@ -1724,7 +1639,7 @@
           <w:szCs w:val="32"/>
         </w:rPr>
       </w:pPr>
-      <w:bookmarkStart w:id="2" w:name="_Toc242610724"/>
+      <w:bookmarkStart w:id="3" w:name="_Toc242610724"/>
       <w:r>
         <w:rPr>
           <w:rFonts w:ascii="Times New Roman" w:hAnsi="Times New Roman" w:cs="Times New Roman"/>
@@ -1737,7 +1652,229 @@
         <w:lastRenderedPageBreak/>
         <w:t>LỜI CẢM ƠN</w:t>
       </w:r>
-      <w:bookmarkEnd w:id="2"/>
+      <w:bookmarkEnd w:id="3"/>
+    </w:p>
+    <w:p>
+      <w:pPr>
+        <w:jc w:val="both"/>
+      </w:pPr>
+      <w:r>
+        <w:rPr>
+          <w:rFonts w:eastAsia="SimSun" w:cs="Times New Roman"/>
+          <w:sz w:val="28"/>
+          <w:szCs w:val="28"/>
+          <w:lang w:eastAsia="zh-CN" w:bidi="ar"/>
+        </w:rPr>
+        <w:t xml:space="preserve">Đầu tiên, nhóm xin </w:t>
+      </w:r>
+      <w:r>
+        <w:rPr>
+          <w:rFonts w:eastAsia="SimSun" w:cs="Times New Roman"/>
+          <w:sz w:val="28"/>
+          <w:szCs w:val="28"/>
+          <w:lang w:eastAsia="zh-CN" w:bidi="ar"/>
+        </w:rPr>
+        <w:t xml:space="preserve">chân thành </w:t>
+      </w:r>
+      <w:r>
+        <w:rPr>
+          <w:rFonts w:eastAsia="SimSun" w:cs="Times New Roman"/>
+          <w:sz w:val="28"/>
+          <w:szCs w:val="28"/>
+          <w:lang w:eastAsia="zh-CN" w:bidi="ar"/>
+        </w:rPr>
+        <w:t xml:space="preserve">gửi lời </w:t>
+      </w:r>
+      <w:r>
+        <w:rPr>
+          <w:rFonts w:eastAsia="SimSun" w:cs="Times New Roman"/>
+          <w:sz w:val="28"/>
+          <w:szCs w:val="28"/>
+          <w:lang w:eastAsia="zh-CN" w:bidi="ar"/>
+        </w:rPr>
+        <w:t>biết</w:t>
+      </w:r>
+      <w:r>
+        <w:rPr>
+          <w:rFonts w:eastAsia="SimSun" w:cs="Times New Roman"/>
+          <w:sz w:val="28"/>
+          <w:szCs w:val="28"/>
+          <w:lang w:eastAsia="zh-CN" w:bidi="ar"/>
+        </w:rPr>
+        <w:t xml:space="preserve"> ơn đến thầy Vũ Đình Long khoa Công nghệ</w:t>
+      </w:r>
+      <w:r>
+        <w:t xml:space="preserve"> </w:t>
+      </w:r>
+      <w:r>
+        <w:rPr>
+          <w:rFonts w:eastAsia="SimSun" w:cs="Times New Roman"/>
+          <w:sz w:val="28"/>
+          <w:szCs w:val="28"/>
+          <w:lang w:eastAsia="zh-CN" w:bidi="ar"/>
+        </w:rPr>
+        <w:t>thông tin đã trang bị cho chúng em những kiến thức cần thiết để áp dụng vào bài báo</w:t>
+      </w:r>
+      <w:r>
+        <w:t xml:space="preserve"> </w:t>
+      </w:r>
+      <w:r>
+        <w:rPr>
+          <w:rFonts w:eastAsia="SimSun" w:cs="Times New Roman"/>
+          <w:sz w:val="28"/>
+          <w:szCs w:val="28"/>
+          <w:lang w:eastAsia="zh-CN" w:bidi="ar"/>
+        </w:rPr>
+        <w:t>cáo này,</w:t>
+      </w:r>
+      <w:r>
+        <w:rPr>
+          <w:rFonts w:eastAsia="SimSun" w:cs="Times New Roman"/>
+          <w:sz w:val="28"/>
+          <w:szCs w:val="28"/>
+          <w:lang w:eastAsia="zh-CN" w:bidi="ar"/>
+        </w:rPr>
+        <w:t xml:space="preserve"> </w:t>
+      </w:r>
+      <w:r>
+        <w:rPr>
+          <w:rFonts w:eastAsia="SimSun" w:cs="Times New Roman"/>
+          <w:sz w:val="28"/>
+          <w:szCs w:val="28"/>
+          <w:lang w:eastAsia="zh-CN" w:bidi="ar"/>
+        </w:rPr>
+        <w:t xml:space="preserve">cũng như trong học tập và công việc sau này. Nhờ có sự hướng dẫn tận tình của thầy, nhóm em đã được học hỏi, trau dồi kiến thức, nghiên cứu kinh nghiệm liên quan đến môn Chuyên đề hệ thống giao thông thông minh nói chung và báo cáo cuối kỳ về </w:t>
+      </w:r>
+      <w:r>
+        <w:rPr>
+          <w:rFonts w:eastAsia="SimSun" w:cs="Times New Roman"/>
+          <w:sz w:val="28"/>
+          <w:szCs w:val="28"/>
+          <w:lang w:eastAsia="zh-CN" w:bidi="ar"/>
+        </w:rPr>
+        <w:t xml:space="preserve">khảo sát các giải pháp giảm ùn tắc giao thông </w:t>
+      </w:r>
+      <w:r>
+        <w:rPr>
+          <w:rFonts w:eastAsia="SimSun" w:cs="Times New Roman"/>
+          <w:sz w:val="28"/>
+          <w:szCs w:val="28"/>
+          <w:lang w:eastAsia="zh-CN" w:bidi="ar"/>
+        </w:rPr>
+        <w:t>nói riêng.</w:t>
+      </w:r>
+      <w:r>
+        <w:rPr>
+          <w:rFonts w:eastAsia="SimSun" w:cs="Times New Roman"/>
+          <w:sz w:val="28"/>
+          <w:szCs w:val="28"/>
+          <w:lang w:eastAsia="zh-CN" w:bidi="ar"/>
+        </w:rPr>
+        <w:t xml:space="preserve"> </w:t>
+      </w:r>
+      <w:r>
+        <w:rPr>
+          <w:rFonts w:eastAsia="SimSun" w:cs="Times New Roman"/>
+          <w:sz w:val="28"/>
+          <w:szCs w:val="28"/>
+          <w:lang w:eastAsia="zh-CN" w:bidi="ar"/>
+        </w:rPr>
+        <w:t xml:space="preserve">Bên cạnh những kiến thức từ môn học này, các môn học khác chúng em được học </w:t>
+      </w:r>
+      <w:r>
+        <w:rPr>
+          <w:rFonts w:eastAsia="SimSun" w:cs="Times New Roman"/>
+          <w:sz w:val="28"/>
+          <w:szCs w:val="28"/>
+          <w:lang w:eastAsia="zh-CN" w:bidi="ar"/>
+        </w:rPr>
+        <w:t>và được hệ thống lại kiến thức</w:t>
+      </w:r>
+      <w:r>
+        <w:rPr>
+          <w:rFonts w:eastAsia="SimSun" w:cs="Times New Roman"/>
+          <w:sz w:val="28"/>
+          <w:szCs w:val="28"/>
+          <w:lang w:eastAsia="zh-CN" w:bidi="ar"/>
+        </w:rPr>
+        <w:t xml:space="preserve">. Giúp nhóm có cái nhìn tổng quan, hiểu sâu hơn về cách thức hoạt động cũng như mối quan hệ giữa các môn học. Nhờ sự dạy bảo của thầy, nhóm có thể áp dụng những kiến thức đã học để áp dụng vào quá trình làm đồ án này. </w:t>
+      </w:r>
+    </w:p>
+    <w:p>
+      <w:r>
+        <w:rPr>
+          <w:rFonts w:eastAsia="SimSun" w:cs="Times New Roman"/>
+          <w:sz w:val="28"/>
+          <w:szCs w:val="28"/>
+          <w:lang w:eastAsia="zh-CN" w:bidi="ar"/>
+        </w:rPr>
+        <w:t xml:space="preserve">Tuy </w:t>
+      </w:r>
+      <w:r>
+        <w:rPr>
+          <w:rFonts w:eastAsia="SimSun" w:cs="Times New Roman"/>
+          <w:sz w:val="28"/>
+          <w:szCs w:val="28"/>
+          <w:lang w:eastAsia="zh-CN" w:bidi="ar"/>
+        </w:rPr>
+        <w:t>vậy</w:t>
+      </w:r>
+      <w:r>
+        <w:rPr>
+          <w:rFonts w:eastAsia="SimSun" w:cs="Times New Roman"/>
+          <w:sz w:val="28"/>
+          <w:szCs w:val="28"/>
+          <w:lang w:eastAsia="zh-CN" w:bidi="ar"/>
+        </w:rPr>
+        <w:t>, do vốn kiến thức còn nhiều hạn chế và chưa có nhiều kinh nghiệm</w:t>
+      </w:r>
+      <w:r>
+        <w:rPr>
+          <w:rFonts w:eastAsia="SimSun" w:cs="Times New Roman"/>
+          <w:sz w:val="28"/>
+          <w:szCs w:val="28"/>
+          <w:lang w:eastAsia="zh-CN" w:bidi="ar"/>
+        </w:rPr>
+        <w:t xml:space="preserve"> </w:t>
+      </w:r>
+      <w:r>
+        <w:rPr>
+          <w:rFonts w:eastAsia="SimSun" w:cs="Times New Roman"/>
+          <w:sz w:val="28"/>
+          <w:szCs w:val="28"/>
+          <w:lang w:eastAsia="zh-CN" w:bidi="ar"/>
+        </w:rPr>
+        <w:t xml:space="preserve">nên trong quá trình nghiên cứu và thực hiện, nhóm chúng em không thể tránh khỏi những thiếu sót. Chúng em rất mong được sự nhận sát và góp ý từ thầy để bản thân chúng em rút kinh nghiệm và có thể hoàn thiện hơn. </w:t>
+      </w:r>
+    </w:p>
+    <w:p>
+      <w:r>
+        <w:rPr>
+          <w:rFonts w:eastAsia="SimSun" w:cs="Times New Roman"/>
+          <w:sz w:val="28"/>
+          <w:szCs w:val="28"/>
+          <w:lang w:eastAsia="zh-CN" w:bidi="ar"/>
+        </w:rPr>
+        <w:t xml:space="preserve">Cuối cùng, nhóm xin gửi lời chúc đến thầy, chúc thầy có </w:t>
+      </w:r>
+      <w:r>
+        <w:rPr>
+          <w:rFonts w:eastAsia="SimSun" w:cs="Times New Roman"/>
+          <w:sz w:val="28"/>
+          <w:szCs w:val="28"/>
+          <w:lang w:eastAsia="zh-CN" w:bidi="ar"/>
+        </w:rPr>
+        <w:t xml:space="preserve">thật </w:t>
+      </w:r>
+      <w:r>
+        <w:rPr>
+          <w:rFonts w:eastAsia="SimSun" w:cs="Times New Roman"/>
+          <w:sz w:val="28"/>
+          <w:szCs w:val="28"/>
+          <w:lang w:eastAsia="zh-CN" w:bidi="ar"/>
+        </w:rPr>
+        <w:t>nhiều sức khỏe và thành công hơn nữa trên con đường giảng dạy của mình.</w:t>
+      </w:r>
     </w:p>
     <w:p>
       <w:pPr>
@@ -1748,11 +1885,26 @@
           <w:bCs/>
         </w:rPr>
       </w:pPr>
+    </w:p>
+    <w:p>
+      <w:pPr>
+        <w:spacing w:after="0" w:line="240" w:lineRule="auto"/>
+        <w:rPr>
+          <w:rFonts w:eastAsiaTheme="majorEastAsia" w:cs="Times New Roman"/>
+          <w:b/>
+          <w:bCs/>
+          <w:sz w:val="32"/>
+          <w:szCs w:val="32"/>
+        </w:rPr>
+      </w:pPr>
+      <w:bookmarkStart w:id="4" w:name="_Toc242610725"/>
       <w:r>
         <w:rPr>
           <w:rFonts w:cs="Times New Roman"/>
           <w:b/>
           <w:bCs/>
+          <w:sz w:val="32"/>
+          <w:szCs w:val="32"/>
         </w:rPr>
         <w:br w:type="page"/>
       </w:r>
@@ -1770,7 +1922,6 @@
           <w:szCs w:val="32"/>
         </w:rPr>
       </w:pPr>
-      <w:bookmarkStart w:id="3" w:name="_Toc242610725"/>
       <w:r>
         <w:rPr>
           <w:rFonts w:ascii="Times New Roman" w:hAnsi="Times New Roman" w:cs="Times New Roman"/>
@@ -1783,20 +1934,80 @@
         <w:lastRenderedPageBreak/>
         <w:t>LỜI MỞ ĐẦU</w:t>
       </w:r>
-      <w:bookmarkEnd w:id="3"/>
+      <w:bookmarkEnd w:id="4"/>
+    </w:p>
+    <w:p>
+      <w:pPr>
+        <w:spacing w:after="0"/>
+        <w:rPr>
+          <w:rFonts w:cs="Times New Roman"/>
+          <w:sz w:val="28"/>
+          <w:szCs w:val="28"/>
+        </w:rPr>
+      </w:pPr>
+      <w:r>
+        <w:rPr>
+          <w:rFonts w:cs="Times New Roman"/>
+          <w:sz w:val="28"/>
+          <w:szCs w:val="28"/>
+        </w:rPr>
+        <w:t>Trong những năm gần đây, cùng với quá trình đô thị hóa và sự phát triển kinh tế – xã hội, nhu cầu đi lại của người dân ngày càng tăng cao, kéo theo số lượng phương tiện tham gia giao thông gia tăng đáng kể, đặc biệt tại các thành phố lớn. Tuy nhiên, sự phát triển của hạ tầng giao thông tại nhiều khu vực chưa theo kịp tốc độ gia tăng phương tiện, dẫn đến tình trạng ùn tắc giao thông thường xuyên xảy ra, nhất là vào các khung giờ cao điểm. Tình trạng này không chỉ làm kéo dài thời gian di chuyển, gây lãng phí nhiên liệu và ảnh hưởng đến chất lượng cuộc sống của người dân mà còn góp phần gia tăng ô nhiễm môi trường, ảnh hưởng đến hoạt động kinh tế và tiềm ẩn nguy cơ mất an toàn giao thông.</w:t>
+      </w:r>
+    </w:p>
+    <w:p>
+      <w:pPr>
+        <w:spacing w:after="0"/>
+        <w:rPr>
+          <w:rFonts w:cs="Times New Roman"/>
+          <w:sz w:val="28"/>
+          <w:szCs w:val="28"/>
+        </w:rPr>
+      </w:pPr>
+      <w:r>
+        <w:rPr>
+          <w:rFonts w:cs="Times New Roman"/>
+          <w:sz w:val="28"/>
+          <w:szCs w:val="28"/>
+        </w:rPr>
+        <w:t>Trước thực trạng đó, việc nghiên cứu và tìm kiếm các giải pháp giảm ùn tắc giao thông đang trở thành một vấn đề cần thiết. Bên cạnh những biện pháp truyền thống như mở rộng đường sá, tổ chức lại luồng phương tiện và điều chỉnh hệ thống đèn tín hiệu, sự phát triển của công nghệ đã mở ra nhiều hướng tiếp cận mới thông qua hệ thống giao thông thông minh (ITS). Các giải pháp ứng dụng camera giám sát, cảm biến, trí tuệ nhân tạo (AI), điều khiển tín hiệu giao thông thích ứng và hệ thống điều hướng phương tiện có khả năng hỗ trợ thu thập dữ liệu, phân tích tình hình giao thông và đưa ra phương án điều hành phù hợp hơn với điều kiện thực tế.</w:t>
+      </w:r>
+    </w:p>
+    <w:p>
+      <w:pPr>
+        <w:spacing w:after="0"/>
+        <w:rPr>
+          <w:rFonts w:cs="Times New Roman"/>
+          <w:sz w:val="28"/>
+          <w:szCs w:val="28"/>
+        </w:rPr>
+      </w:pPr>
+      <w:r>
+        <w:rPr>
+          <w:rFonts w:cs="Times New Roman"/>
+          <w:sz w:val="28"/>
+          <w:szCs w:val="28"/>
+        </w:rPr>
+        <w:t>Xuất phát từ thực tiễn trên, nhóm lựa chọn đề tài “Khảo sát các giải pháp giảm ùn tắc giao thông” nhằm tìm hiểu thực trạng ùn tắc, thu thập hình ảnh và số liệu thực tế để đánh giá mức độ cũng như xác định các nguyên nhân chủ yếu. Trên cơ sở đó, nhóm tiến hành tìm hiểu, phân tích và so sánh các giải pháp hiện có, đồng thời đánh giá tính khả thi và đề xuất những phương án phù hợp với điều kiện hạ tầng, công nghệ và nhu cầu giao thông tại Việt Nam.</w:t>
+      </w:r>
     </w:p>
     <w:p>
       <w:pPr>
         <w:spacing w:after="0" w:line="240" w:lineRule="auto"/>
         <w:rPr>
           <w:rFonts w:eastAsiaTheme="majorEastAsia" w:cs="Times New Roman"/>
-          <w:sz w:val="40"/>
-          <w:szCs w:val="40"/>
+          <w:b/>
+          <w:bCs/>
+          <w:sz w:val="32"/>
+          <w:szCs w:val="32"/>
         </w:rPr>
       </w:pPr>
       <w:r>
         <w:rPr>
           <w:rFonts w:cs="Times New Roman"/>
+          <w:b/>
+          <w:bCs/>
+          <w:sz w:val="32"/>
+          <w:szCs w:val="32"/>
         </w:rPr>
         <w:br w:type="page"/>
       </w:r>
@@ -1829,19 +2040,262 @@
     </w:p>
     <w:p>
       <w:pPr>
+        <w:spacing w:before="100" w:beforeAutospacing="1" w:after="160"/>
+        <w:rPr>
+          <w:rFonts w:eastAsia="Times New Roman" w:cs="Times New Roman"/>
+          <w:kern w:val="2"/>
+          <w:sz w:val="28"/>
+          <w:szCs w:val="28"/>
+        </w:rPr>
+      </w:pPr>
+      <w:r>
+        <w:rPr>
+          <w:rFonts w:eastAsia="Times New Roman" w:cs="Times New Roman"/>
+          <w:kern w:val="2"/>
+          <w:sz w:val="28"/>
+          <w:szCs w:val="28"/>
+        </w:rPr>
+        <w:t>Đến với lý do chọn đề tài</w:t>
+      </w:r>
+    </w:p>
+    <w:p>
+      <w:pPr>
+        <w:spacing w:before="100" w:beforeAutospacing="1" w:after="160"/>
+        <w:rPr>
+          <w:rFonts w:eastAsia="Times New Roman" w:cs="Times New Roman"/>
+          <w:kern w:val="2"/>
+          <w:sz w:val="28"/>
+          <w:szCs w:val="28"/>
+        </w:rPr>
+      </w:pPr>
+      <w:r>
+        <w:rPr>
+          <w:rFonts w:eastAsia="Times New Roman" w:cs="Times New Roman"/>
+          <w:kern w:val="2"/>
+          <w:sz w:val="28"/>
+          <w:szCs w:val="28"/>
+        </w:rPr>
+        <w:t>Đô thị hóa nhanh và sự gia tăng phương tiện cá nhân khiến ùn tắc giao thông ngày càng nghiêm trọng ở các đô thị lớn. TP. Hồ Chí Minh là nơi bài toán này đặc biệt cấp thiết, vì thành phố mở rộng sau hợp nhất, lượng phương tiện rất lớn và nhiều điểm nóng ùn tắc tập trung ở khu trung tâm và các cửa ngõ. Thành phố đang kết hợp giải pháp công trình với giải pháp phi công trình và công nghệ, trong đó có các giải pháp thuộc hệ thống giao thông thông minh (ITS). Vì vậy, nhóm chọn đề tài “Khảo sát các giải pháp giảm ùn tắc giao thông”, lấy TP.HCM làm địa bàn khảo sát cụ thể.</w:t>
+      </w:r>
+      <w:r>
+        <w:rPr>
+          <w:rFonts w:eastAsia="Times New Roman" w:cs="Times New Roman"/>
+          <w:kern w:val="2"/>
+          <w:sz w:val="28"/>
+          <w:szCs w:val="28"/>
+        </w:rPr>
+        <w:tab/>
+      </w:r>
+    </w:p>
+    <w:p>
+      <w:pPr>
+        <w:spacing w:before="100" w:beforeAutospacing="1" w:after="160"/>
+        <w:rPr>
+          <w:rFonts w:eastAsia="Times New Roman" w:cs="Times New Roman"/>
+          <w:kern w:val="2"/>
+          <w:sz w:val="28"/>
+          <w:szCs w:val="28"/>
+        </w:rPr>
+      </w:pPr>
+      <w:r>
+        <w:rPr>
+          <w:rFonts w:eastAsia="Times New Roman" w:cs="Times New Roman"/>
+          <w:kern w:val="2"/>
+          <w:sz w:val="28"/>
+          <w:szCs w:val="28"/>
+        </w:rPr>
+        <w:t>Vấn đề nghiêm trọng về ùn tắc giao thông tại Việt Nam</w:t>
+      </w:r>
+    </w:p>
+    <w:p>
+      <w:pPr>
+        <w:spacing w:before="100" w:beforeAutospacing="1" w:after="160"/>
+        <w:rPr>
+          <w:rFonts w:eastAsia="Times New Roman" w:cs="Times New Roman"/>
+          <w:kern w:val="2"/>
+          <w:sz w:val="28"/>
+          <w:szCs w:val="28"/>
+        </w:rPr>
+      </w:pPr>
+      <w:r>
+        <w:rPr>
+          <w:rFonts w:eastAsia="Times New Roman" w:cs="Times New Roman"/>
+          <w:kern w:val="2"/>
+          <w:sz w:val="28"/>
+          <w:szCs w:val="28"/>
+        </w:rPr>
+        <w:t>Ùn tắc là vấn đề nghiêm trọng và có xu hướng tăng ở các đô thị lớn. Nguyên nhân chính gồm cơ cấu phương tiện lệch về xe cá nhân (chủ yếu là xe máy) và hạ tầng chưa theo kịp tốc độ đô thị hóa. Ùn tắc còn gây thiệt hại đáng kể về thời gian, nhiên liệu và năng suất kinh tế.</w:t>
+      </w:r>
+    </w:p>
+    <w:p>
+      <w:pPr>
+        <w:spacing w:before="100" w:beforeAutospacing="1" w:after="160"/>
+        <w:jc w:val="center"/>
+        <w:rPr>
+          <w:rFonts w:eastAsia="Times New Roman" w:cs="Times New Roman"/>
+          <w:kern w:val="2"/>
+          <w:sz w:val="28"/>
+          <w:szCs w:val="28"/>
+        </w:rPr>
+      </w:pPr>
+      <w:r>
+        <w:rPr>
+          <w:rFonts w:eastAsia="Times New Roman" w:cs="Times New Roman"/>
+          <w:kern w:val="2"/>
+          <w:sz w:val="28"/>
+          <w:szCs w:val="28"/>
+        </w:rPr>
+        <w:drawing>
+          <wp:inline distT="0" distB="0" distL="0" distR="0" wp14:anchorId="78001045" wp14:editId="29382A1C">
+            <wp:extent cx="4876800" cy="2720340"/>
+            <wp:effectExtent l="0" t="0" r="0" b="3810"/>
+            <wp:docPr id="2" name="Picture 2"/>
+            <wp:cNvGraphicFramePr>
+              <a:graphicFrameLocks xmlns:a="http://schemas.openxmlformats.org/drawingml/2006/main" noChangeAspect="1"/>
+            </wp:cNvGraphicFramePr>
+            <a:graphic xmlns:a="http://schemas.openxmlformats.org/drawingml/2006/main">
+              <a:graphicData uri="http://schemas.openxmlformats.org/drawingml/2006/picture">
+                <pic:pic xmlns:pic="http://schemas.openxmlformats.org/drawingml/2006/picture">
+                  <pic:nvPicPr>
+                    <pic:cNvPr id="0" name="Picture 6"/>
+                    <pic:cNvPicPr>
+                      <a:picLocks noChangeAspect="1" noChangeArrowheads="1"/>
+                    </pic:cNvPicPr>
+                  </pic:nvPicPr>
+                  <pic:blipFill>
+                    <a:blip r:embed="rId10">
+                      <a:extLst>
+                        <a:ext uri="{28A0092B-C50C-407E-A947-70E740481C1C}">
+                          <a14:useLocalDpi xmlns:a14="http://schemas.microsoft.com/office/drawing/2010/main" val="0"/>
+                        </a:ext>
+                      </a:extLst>
+                    </a:blip>
+                    <a:srcRect/>
+                    <a:stretch>
+                      <a:fillRect/>
+                    </a:stretch>
+                  </pic:blipFill>
+                  <pic:spPr bwMode="auto">
+                    <a:xfrm>
+                      <a:off x="0" y="0"/>
+                      <a:ext cx="4876800" cy="2720340"/>
+                    </a:xfrm>
+                    <a:prstGeom prst="rect">
+                      <a:avLst/>
+                    </a:prstGeom>
+                    <a:noFill/>
+                    <a:ln>
+                      <a:noFill/>
+                    </a:ln>
+                  </pic:spPr>
+                </pic:pic>
+              </a:graphicData>
+            </a:graphic>
+          </wp:inline>
+        </w:drawing>
+      </w:r>
+    </w:p>
+    <w:p>
+      <w:pPr>
+        <w:pStyle w:val="Caption"/>
+        <w:jc w:val="center"/>
+        <w:rPr>
+          <w:color w:val="auto"/>
+          <w:sz w:val="28"/>
+          <w:szCs w:val="28"/>
+        </w:rPr>
+      </w:pPr>
+      <w:r>
+        <w:rPr>
+          <w:color w:val="auto"/>
+          <w:sz w:val="28"/>
+          <w:szCs w:val="28"/>
+        </w:rPr>
+        <w:t xml:space="preserve">Hình </w:t>
+      </w:r>
+      <w:r>
+        <w:rPr>
+          <w:color w:val="auto"/>
+          <w:sz w:val="28"/>
+          <w:szCs w:val="28"/>
+        </w:rPr>
+        <w:fldChar w:fldCharType="begin"/>
+      </w:r>
+      <w:r>
+        <w:rPr>
+          <w:color w:val="auto"/>
+          <w:sz w:val="28"/>
+          <w:szCs w:val="28"/>
+        </w:rPr>
+        <w:instrText xml:space="preserve"> SEQ Hình \* ARABIC </w:instrText>
+      </w:r>
+      <w:r>
+        <w:rPr>
+          <w:color w:val="auto"/>
+          <w:sz w:val="28"/>
+          <w:szCs w:val="28"/>
+        </w:rPr>
+        <w:fldChar w:fldCharType="separate"/>
+      </w:r>
+      <w:r>
+        <w:rPr>
+          <w:noProof/>
+          <w:color w:val="auto"/>
+          <w:sz w:val="28"/>
+          <w:szCs w:val="28"/>
+        </w:rPr>
+        <w:t>1</w:t>
+      </w:r>
+      <w:r>
+        <w:rPr>
+          <w:color w:val="auto"/>
+          <w:sz w:val="28"/>
+          <w:szCs w:val="28"/>
+        </w:rPr>
+        <w:fldChar w:fldCharType="end"/>
+      </w:r>
+      <w:r>
+        <w:rPr>
+          <w:rFonts w:eastAsia="Times New Roman" w:cs="Times New Roman"/>
+          <w:color w:val="auto"/>
+          <w:kern w:val="2"/>
+          <w:sz w:val="28"/>
+          <w:szCs w:val="28"/>
+        </w:rPr>
+        <w:t>: sơ đồ vị trí các điểm nóng ùn tắc</w:t>
+      </w:r>
+    </w:p>
+    <w:p>
+      <w:pPr>
+        <w:spacing w:before="100" w:beforeAutospacing="1" w:after="160"/>
+        <w:rPr>
+          <w:rFonts w:eastAsia="Times New Roman" w:cs="Times New Roman"/>
+          <w:kern w:val="2"/>
+          <w:sz w:val="28"/>
+          <w:szCs w:val="28"/>
+        </w:rPr>
+      </w:pPr>
+    </w:p>
+    <w:p>
+      <w:pPr>
+        <w:spacing w:before="100" w:beforeAutospacing="1" w:after="160"/>
+        <w:rPr>
+          <w:rFonts w:eastAsia="Times New Roman" w:cs="Times New Roman"/>
+          <w:kern w:val="2"/>
+          <w:sz w:val="28"/>
+          <w:szCs w:val="28"/>
+        </w:rPr>
+      </w:pPr>
+    </w:p>
+    <w:p>
+      <w:pPr>
         <w:spacing w:after="0" w:line="240" w:lineRule="auto"/>
         <w:rPr>
           <w:rFonts w:eastAsiaTheme="majorEastAsia" w:cs="Times New Roman"/>
-          <w:sz w:val="40"/>
-          <w:szCs w:val="40"/>
-        </w:rPr>
-      </w:pPr>
-      <w:r>
-        <w:rPr>
-          <w:rFonts w:cs="Times New Roman"/>
-        </w:rPr>
-        <w:br w:type="page"/>
-      </w:r>
+          <w:sz w:val="28"/>
+          <w:szCs w:val="28"/>
+        </w:rPr>
+      </w:pPr>
     </w:p>
     <w:p>
       <w:pPr>
@@ -1867,9 +2321,949 @@
         <w:lastRenderedPageBreak/>
         <w:t>CHƯƠNG 1:</w:t>
       </w:r>
-    </w:p>
+      <w:r>
+        <w:rPr>
+          <w:rFonts w:ascii="Times New Roman" w:hAnsi="Times New Roman" w:cs="Times New Roman"/>
+          <w:b/>
+          <w:bCs/>
+          <w:color w:val="auto"/>
+          <w:sz w:val="32"/>
+          <w:szCs w:val="32"/>
+        </w:rPr>
+        <w:t xml:space="preserve"> </w:t>
+      </w:r>
+      <w:r>
+        <w:rPr>
+          <w:rFonts w:ascii="Times New Roman" w:hAnsi="Times New Roman" w:cs="Times New Roman"/>
+          <w:b/>
+          <w:bCs/>
+          <w:color w:val="auto"/>
+          <w:sz w:val="32"/>
+          <w:szCs w:val="32"/>
+        </w:rPr>
+        <w:t>TỔNG QUAN ĐỀ TÀI</w:t>
+      </w:r>
+    </w:p>
+    <w:p>
+      <w:pPr>
+        <w:pStyle w:val="Heading2"/>
+        <w:numPr>
+          <w:ilvl w:val="0"/>
+          <w:numId w:val="1"/>
+        </w:numPr>
+        <w:rPr>
+          <w:color w:val="auto"/>
+        </w:rPr>
+      </w:pPr>
+      <w:r>
+        <w:rPr>
+          <w:color w:val="auto"/>
+        </w:rPr>
+        <w:t xml:space="preserve"> Mục tiêu của đề tài</w:t>
+      </w:r>
+    </w:p>
+    <w:p>
+      <w:pPr>
+        <w:rPr>
+          <w:sz w:val="28"/>
+          <w:szCs w:val="28"/>
+        </w:rPr>
+      </w:pPr>
+      <w:r>
+        <w:rPr>
+          <w:sz w:val="28"/>
+          <w:szCs w:val="28"/>
+        </w:rPr>
+        <w:t>Mục tiêu chung. Khảo sát thực trạng ùn tắc giao thông và các giải pháp giảm ùn tắc, từ đó rút ra nhận định về hiệu quả và khả năng ứng dụng, đặc biệt là các giải pháp thuộc hệ thống giao thông thông minh.</w:t>
+      </w:r>
+    </w:p>
+    <w:p>
+      <w:pPr>
+        <w:rPr>
+          <w:sz w:val="28"/>
+          <w:szCs w:val="28"/>
+        </w:rPr>
+      </w:pPr>
+      <w:r>
+        <w:rPr>
+          <w:sz w:val="28"/>
+          <w:szCs w:val="28"/>
+        </w:rPr>
+        <w:t>Mục tiêu cụ thể</w:t>
+      </w:r>
+      <w:r>
+        <w:rPr>
+          <w:sz w:val="28"/>
+          <w:szCs w:val="28"/>
+        </w:rPr>
+        <w:t>:</w:t>
+      </w:r>
+    </w:p>
+    <w:p>
+      <w:pPr>
+        <w:pStyle w:val="ListParagraph"/>
+        <w:numPr>
+          <w:ilvl w:val="0"/>
+          <w:numId w:val="3"/>
+        </w:numPr>
+        <w:rPr>
+          <w:sz w:val="28"/>
+          <w:szCs w:val="28"/>
+        </w:rPr>
+      </w:pPr>
+      <w:r>
+        <w:rPr>
+          <w:sz w:val="28"/>
+          <w:szCs w:val="28"/>
+        </w:rPr>
+        <w:t>Khảo sát thực trạng ùn tắc giao thông tại địa bàn nghiên cứu: quy mô phương tiện, mức độ ùn tắc, các điểm nóng và thiệt hại.</w:t>
+      </w:r>
+    </w:p>
+    <w:p>
+      <w:pPr>
+        <w:pStyle w:val="ListParagraph"/>
+        <w:numPr>
+          <w:ilvl w:val="0"/>
+          <w:numId w:val="3"/>
+        </w:numPr>
+        <w:rPr>
+          <w:sz w:val="28"/>
+          <w:szCs w:val="28"/>
+        </w:rPr>
+      </w:pPr>
+      <w:r>
+        <w:rPr>
+          <w:sz w:val="28"/>
+          <w:szCs w:val="28"/>
+        </w:rPr>
+        <w:t>Phân tích các nguyên nhân chính gây ùn tắc (cơ cấu phương tiện, hạ tầng, tổ chức giao thông, thi công, xử lý sự cố)</w:t>
+      </w:r>
+      <w:r>
+        <w:rPr>
+          <w:sz w:val="28"/>
+          <w:szCs w:val="28"/>
+        </w:rPr>
+        <w:t>.</w:t>
+      </w:r>
+    </w:p>
+    <w:p>
+      <w:pPr>
+        <w:pStyle w:val="ListParagraph"/>
+        <w:numPr>
+          <w:ilvl w:val="0"/>
+          <w:numId w:val="3"/>
+        </w:numPr>
+        <w:rPr>
+          <w:sz w:val="28"/>
+          <w:szCs w:val="28"/>
+        </w:rPr>
+      </w:pPr>
+      <w:r>
+        <w:rPr>
+          <w:sz w:val="28"/>
+          <w:szCs w:val="28"/>
+        </w:rPr>
+        <w:t>Tổng hợp các nhóm giải pháp giảm ùn tắc đang được áp dụng hoặc đề xuất: giải pháp công trình, giải pháp phi công trình (tổ chức giao thông, quản lý phương tiện cá nhân, phát triển giao thông công cộng) và giải pháp ứng dụng công nghệ ITS</w:t>
+      </w:r>
+      <w:r>
+        <w:rPr>
+          <w:sz w:val="28"/>
+          <w:szCs w:val="28"/>
+        </w:rPr>
+        <w:t>.</w:t>
+      </w:r>
+    </w:p>
+    <w:p>
+      <w:pPr>
+        <w:pStyle w:val="ListParagraph"/>
+        <w:numPr>
+          <w:ilvl w:val="0"/>
+          <w:numId w:val="3"/>
+        </w:numPr>
+        <w:rPr>
+          <w:sz w:val="28"/>
+          <w:szCs w:val="28"/>
+        </w:rPr>
+      </w:pPr>
+      <w:r>
+        <w:rPr>
+          <w:sz w:val="28"/>
+          <w:szCs w:val="28"/>
+        </w:rPr>
+        <w:t>Phân tích, so sánh ưu điểm, hạn chế và điều kiện áp dụng của từng nhóm giải pháp.</w:t>
+      </w:r>
+    </w:p>
+    <w:p>
+      <w:pPr>
+        <w:pStyle w:val="ListParagraph"/>
+        <w:numPr>
+          <w:ilvl w:val="0"/>
+          <w:numId w:val="3"/>
+        </w:numPr>
+        <w:rPr>
+          <w:sz w:val="28"/>
+          <w:szCs w:val="28"/>
+        </w:rPr>
+      </w:pPr>
+      <w:r>
+        <w:rPr>
+          <w:sz w:val="28"/>
+          <w:szCs w:val="28"/>
+        </w:rPr>
+        <w:t>Đề xuất hướng ưu tiên và kiến nghị cho địa bàn nghiên cứu.</w:t>
+      </w:r>
+    </w:p>
+    <w:p>
+      <w:pPr>
+        <w:pStyle w:val="Heading2"/>
+        <w:numPr>
+          <w:ilvl w:val="0"/>
+          <w:numId w:val="1"/>
+        </w:numPr>
+        <w:rPr>
+          <w:color w:val="auto"/>
+        </w:rPr>
+      </w:pPr>
+      <w:r>
+        <w:rPr>
+          <w:color w:val="auto"/>
+        </w:rPr>
+        <w:t>Phạm vi nghiên cứu</w:t>
+      </w:r>
+    </w:p>
+    <w:p>
+      <w:pPr>
+        <w:pStyle w:val="Heading3"/>
+        <w:numPr>
+          <w:ilvl w:val="1"/>
+          <w:numId w:val="1"/>
+        </w:numPr>
+        <w:ind w:hanging="522"/>
+        <w:rPr>
+          <w:color w:val="auto"/>
+        </w:rPr>
+      </w:pPr>
+      <w:r>
+        <w:rPr>
+          <w:color w:val="auto"/>
+        </w:rPr>
+        <w:t>Phạm vi không gian (vị trí)</w:t>
+      </w:r>
+    </w:p>
+    <w:p>
+      <w:pPr>
+        <w:rPr>
+          <w:sz w:val="28"/>
+          <w:szCs w:val="28"/>
+        </w:rPr>
+      </w:pPr>
+      <w:r>
+        <w:rPr>
+          <w:b/>
+          <w:bCs/>
+          <w:sz w:val="28"/>
+          <w:szCs w:val="28"/>
+        </w:rPr>
+        <w:t>Trọng điểm nghiên cứu:</w:t>
+      </w:r>
+      <w:r>
+        <w:rPr>
+          <w:sz w:val="28"/>
+          <w:szCs w:val="28"/>
+        </w:rPr>
+        <w:t xml:space="preserve"> Tâm nút giao ngã tư Hàng Xanh (giao lộ Điện Biên Phủ – Xô Viết Nghệ Tĩnh, Quận Bình Thạnh).</w:t>
+      </w:r>
+    </w:p>
+    <w:p>
+      <w:pPr>
+        <w:rPr>
+          <w:sz w:val="28"/>
+          <w:szCs w:val="28"/>
+        </w:rPr>
+      </w:pPr>
+      <w:r>
+        <w:rPr>
+          <w:b/>
+          <w:bCs/>
+          <w:sz w:val="28"/>
+          <w:szCs w:val="28"/>
+        </w:rPr>
+        <w:t>Bán kính tác động trực tiếp:</w:t>
+      </w:r>
+      <w:r>
+        <w:rPr>
+          <w:sz w:val="28"/>
+          <w:szCs w:val="28"/>
+        </w:rPr>
+        <w:t xml:space="preserve"> Bán kính 1,5 km xung quanh ngã tư Hàng Xanh.</w:t>
+      </w:r>
+    </w:p>
+    <w:p>
+      <w:pPr>
+        <w:rPr>
+          <w:b/>
+          <w:bCs/>
+          <w:sz w:val="28"/>
+          <w:szCs w:val="28"/>
+        </w:rPr>
+      </w:pPr>
+      <w:r>
+        <w:rPr>
+          <w:b/>
+          <w:bCs/>
+          <w:sz w:val="28"/>
+          <w:szCs w:val="28"/>
+        </w:rPr>
+        <w:t>Các hành lang và nút giao liên kết chính:</w:t>
+      </w:r>
+    </w:p>
+    <w:p>
+      <w:pPr>
+        <w:pStyle w:val="ListParagraph"/>
+        <w:numPr>
+          <w:ilvl w:val="0"/>
+          <w:numId w:val="3"/>
+        </w:numPr>
+        <w:rPr>
+          <w:sz w:val="28"/>
+          <w:szCs w:val="28"/>
+        </w:rPr>
+      </w:pPr>
+      <w:r>
+        <w:rPr>
+          <w:sz w:val="28"/>
+          <w:szCs w:val="28"/>
+        </w:rPr>
+        <w:t>Trục Xô Viết Nghệ Tĩnh: Đoạn từ ngã tư Hàng Xanh đến Ngã 5 Đài Liệt Sĩ (dài khoảng 1–2 km kéo dài tới chân cầu Bình Triệu 1).</w:t>
+      </w:r>
+    </w:p>
+    <w:p>
+      <w:pPr>
+        <w:pStyle w:val="ListParagraph"/>
+        <w:numPr>
+          <w:ilvl w:val="0"/>
+          <w:numId w:val="3"/>
+        </w:numPr>
+        <w:rPr>
+          <w:sz w:val="28"/>
+          <w:szCs w:val="28"/>
+        </w:rPr>
+      </w:pPr>
+      <w:r>
+        <w:rPr>
+          <w:sz w:val="28"/>
+          <w:szCs w:val="28"/>
+        </w:rPr>
+        <w:t>Trục Đinh Bộ Lĩnh: Đoạn từ đường Điện Biên Phủ / nút giao Bạch Đằng đến chân cầu Bình Triệu 2.</w:t>
+      </w:r>
+    </w:p>
+    <w:p>
+      <w:pPr>
+        <w:pStyle w:val="ListParagraph"/>
+        <w:numPr>
+          <w:ilvl w:val="0"/>
+          <w:numId w:val="3"/>
+        </w:numPr>
+        <w:rPr>
+          <w:sz w:val="28"/>
+          <w:szCs w:val="28"/>
+        </w:rPr>
+      </w:pPr>
+      <w:r>
+        <w:rPr>
+          <w:sz w:val="28"/>
+          <w:szCs w:val="28"/>
+        </w:rPr>
+        <w:t>Trục Ung Văn Khiêm: Đoạn dài 1,7 km nối từ Ngã 5 Đài Liệt Sĩ ra khu vực Tân Cảng / Điện Biên Phủ.</w:t>
+      </w:r>
+    </w:p>
+    <w:p>
+      <w:pPr>
+        <w:rPr>
+          <w:sz w:val="28"/>
+          <w:szCs w:val="28"/>
+        </w:rPr>
+      </w:pPr>
+      <w:r>
+        <w:rPr>
+          <w:b/>
+          <w:bCs/>
+          <w:sz w:val="28"/>
+          <w:szCs w:val="28"/>
+        </w:rPr>
+        <w:t>Các tuyến phụ lưu &amp; nút giao phụ:</w:t>
+      </w:r>
+      <w:r>
+        <w:rPr>
+          <w:sz w:val="28"/>
+          <w:szCs w:val="28"/>
+        </w:rPr>
+        <w:t xml:space="preserve"> Đường Nguyễn Gia Trí (D2 cũ), Nguyễn Văn Thương (D1 cũ), Chu Văn An, Bạch Đằng, khu vực cầu Sơn và Ngã 5 Đài Liệt Sĩ.</w:t>
+      </w:r>
+    </w:p>
+    <w:p>
+      <w:pPr>
+        <w:rPr>
+          <w:sz w:val="28"/>
+          <w:szCs w:val="28"/>
+        </w:rPr>
+      </w:pPr>
+      <w:r>
+        <w:rPr>
+          <w:b/>
+          <w:bCs/>
+          <w:sz w:val="28"/>
+          <w:szCs w:val="28"/>
+        </w:rPr>
+        <w:lastRenderedPageBreak/>
+        <w:t>Vùng ảnh hưởng lan tỏa:</w:t>
+      </w:r>
+      <w:r>
+        <w:rPr>
+          <w:sz w:val="28"/>
+          <w:szCs w:val="28"/>
+        </w:rPr>
+        <w:t xml:space="preserve"> Trục Điện Biên Phủ kéo ngược về cầu Sài Gòn, các tuyến vành đai lân cận như Phạm Văn Đồng, Nguyễn Xí, Nơ Trang Long; kết nối với 2 nhà ga trên cao của Tuyến Metro số 1 nằm trong bán kính 800 m – 1,2 km (Ga Công viên Văn Thánh và Ga Tân Cảng).</w:t>
+      </w:r>
+    </w:p>
+    <w:p>
+      <w:pPr>
+        <w:rPr>
+          <w:sz w:val="28"/>
+          <w:szCs w:val="28"/>
+        </w:rPr>
+      </w:pPr>
+      <w:r>
+        <w:rPr>
+          <w:sz w:val="28"/>
+          <w:szCs w:val="28"/>
+        </w:rPr>
+        <w:drawing>
+          <wp:inline distT="0" distB="0" distL="0" distR="0" wp14:anchorId="6D6DD360" wp14:editId="10FFF7AB">
+            <wp:extent cx="5731510" cy="3413125"/>
+            <wp:effectExtent l="0" t="0" r="2540" b="0"/>
+            <wp:docPr id="5" name="Picture 5"/>
+            <wp:cNvGraphicFramePr>
+              <a:graphicFrameLocks xmlns:a="http://schemas.openxmlformats.org/drawingml/2006/main" noChangeAspect="1"/>
+            </wp:cNvGraphicFramePr>
+            <a:graphic xmlns:a="http://schemas.openxmlformats.org/drawingml/2006/main">
+              <a:graphicData uri="http://schemas.openxmlformats.org/drawingml/2006/picture">
+                <pic:pic xmlns:pic="http://schemas.openxmlformats.org/drawingml/2006/picture">
+                  <pic:nvPicPr>
+                    <pic:cNvPr id="0" name="Picture 13"/>
+                    <pic:cNvPicPr>
+                      <a:picLocks noChangeAspect="1" noChangeArrowheads="1"/>
+                    </pic:cNvPicPr>
+                  </pic:nvPicPr>
+                  <pic:blipFill>
+                    <a:blip r:embed="rId11">
+                      <a:extLst>
+                        <a:ext uri="{28A0092B-C50C-407E-A947-70E740481C1C}">
+                          <a14:useLocalDpi xmlns:a14="http://schemas.microsoft.com/office/drawing/2010/main" val="0"/>
+                        </a:ext>
+                      </a:extLst>
+                    </a:blip>
+                    <a:srcRect/>
+                    <a:stretch>
+                      <a:fillRect/>
+                    </a:stretch>
+                  </pic:blipFill>
+                  <pic:spPr bwMode="auto">
+                    <a:xfrm>
+                      <a:off x="0" y="0"/>
+                      <a:ext cx="5731510" cy="3413125"/>
+                    </a:xfrm>
+                    <a:prstGeom prst="rect">
+                      <a:avLst/>
+                    </a:prstGeom>
+                    <a:noFill/>
+                    <a:ln>
+                      <a:noFill/>
+                    </a:ln>
+                  </pic:spPr>
+                </pic:pic>
+              </a:graphicData>
+            </a:graphic>
+          </wp:inline>
+        </w:drawing>
+      </w:r>
+      <w:r>
+        <w:rPr>
+          <w:sz w:val="28"/>
+          <w:szCs w:val="28"/>
+        </w:rPr>
+        <w:t xml:space="preserve"> </w:t>
+      </w:r>
+    </w:p>
+    <w:p>
+      <w:pPr>
+        <w:pStyle w:val="Caption"/>
+        <w:jc w:val="center"/>
+        <w:rPr>
+          <w:color w:val="auto"/>
+          <w:sz w:val="28"/>
+          <w:szCs w:val="28"/>
+        </w:rPr>
+      </w:pPr>
+      <w:r>
+        <w:rPr>
+          <w:color w:val="auto"/>
+          <w:sz w:val="28"/>
+          <w:szCs w:val="28"/>
+        </w:rPr>
+        <w:t xml:space="preserve">Hình </w:t>
+      </w:r>
+      <w:r>
+        <w:rPr>
+          <w:color w:val="auto"/>
+          <w:sz w:val="28"/>
+          <w:szCs w:val="28"/>
+        </w:rPr>
+        <w:fldChar w:fldCharType="begin"/>
+      </w:r>
+      <w:r>
+        <w:rPr>
+          <w:color w:val="auto"/>
+          <w:sz w:val="28"/>
+          <w:szCs w:val="28"/>
+        </w:rPr>
+        <w:instrText xml:space="preserve"> SEQ Hình \* ARABIC </w:instrText>
+      </w:r>
+      <w:r>
+        <w:rPr>
+          <w:color w:val="auto"/>
+          <w:sz w:val="28"/>
+          <w:szCs w:val="28"/>
+        </w:rPr>
+        <w:fldChar w:fldCharType="separate"/>
+      </w:r>
+      <w:r>
+        <w:rPr>
+          <w:noProof/>
+          <w:color w:val="auto"/>
+          <w:sz w:val="28"/>
+          <w:szCs w:val="28"/>
+        </w:rPr>
+        <w:t>2</w:t>
+      </w:r>
+      <w:r>
+        <w:rPr>
+          <w:color w:val="auto"/>
+          <w:sz w:val="28"/>
+          <w:szCs w:val="28"/>
+        </w:rPr>
+        <w:fldChar w:fldCharType="end"/>
+      </w:r>
+      <w:r>
+        <w:rPr>
+          <w:color w:val="auto"/>
+          <w:sz w:val="28"/>
+          <w:szCs w:val="28"/>
+        </w:rPr>
+        <w:t>: kẹt xe ở ngã tư hàng xanh</w:t>
+      </w:r>
+    </w:p>
+    <w:p>
+      <w:pPr>
+        <w:pStyle w:val="Heading3"/>
+        <w:numPr>
+          <w:ilvl w:val="1"/>
+          <w:numId w:val="1"/>
+        </w:numPr>
+        <w:ind w:hanging="522"/>
+        <w:rPr>
+          <w:color w:val="auto"/>
+        </w:rPr>
+      </w:pPr>
+      <w:r>
+        <w:rPr>
+          <w:color w:val="auto"/>
+        </w:rPr>
+        <w:t>Phạm vi thời gian</w:t>
+      </w:r>
+    </w:p>
+    <w:p>
+      <w:pPr>
+        <w:rPr>
+          <w:b/>
+          <w:bCs/>
+          <w:sz w:val="28"/>
+          <w:szCs w:val="28"/>
+        </w:rPr>
+      </w:pPr>
+      <w:r>
+        <w:rPr>
+          <w:b/>
+          <w:bCs/>
+          <w:sz w:val="28"/>
+          <w:szCs w:val="28"/>
+        </w:rPr>
+        <w:t>Khung giờ cao điểm trong ngày:</w:t>
+      </w:r>
+    </w:p>
+    <w:p>
+      <w:pPr>
+        <w:pStyle w:val="ListParagraph"/>
+        <w:numPr>
+          <w:ilvl w:val="0"/>
+          <w:numId w:val="3"/>
+        </w:numPr>
+        <w:rPr>
+          <w:sz w:val="28"/>
+          <w:szCs w:val="28"/>
+        </w:rPr>
+      </w:pPr>
+      <w:r>
+        <w:rPr>
+          <w:sz w:val="28"/>
+          <w:szCs w:val="28"/>
+        </w:rPr>
+        <w:t>Cao điểm sáng (06:00 – 09:30): Tập trung áp lực di chuyển theo hướng đi vào trung tâm thành phố qua cầu Bình Triệu và đường Đinh Bộ Lĩnh</w:t>
+      </w:r>
+    </w:p>
+    <w:p>
+      <w:pPr>
+        <w:pStyle w:val="ListParagraph"/>
+        <w:numPr>
+          <w:ilvl w:val="0"/>
+          <w:numId w:val="3"/>
+        </w:numPr>
+        <w:rPr>
+          <w:sz w:val="28"/>
+          <w:szCs w:val="28"/>
+        </w:rPr>
+      </w:pPr>
+      <w:r>
+        <w:rPr>
+          <w:sz w:val="28"/>
+          <w:szCs w:val="28"/>
+        </w:rPr>
+        <w:t>Cao điểm chiều (16:30 – 19:30): Tập trung bùng phát ùn tắc theo hướng từ trung tâm đổ về cửa ngõ Đông Bắc qua Xô Viết Nghệ Tĩnh, Ngã 5 Đài Liệt Sĩ và Ung Văn Khiêm.</w:t>
+      </w:r>
+    </w:p>
+    <w:p>
+      <w:pPr>
+        <w:rPr>
+          <w:sz w:val="28"/>
+          <w:szCs w:val="28"/>
+        </w:rPr>
+      </w:pPr>
+      <w:r>
+        <w:rPr>
+          <w:b/>
+          <w:bCs/>
+          <w:sz w:val="28"/>
+          <w:szCs w:val="28"/>
+        </w:rPr>
+        <w:t>Khung giờ túc trực điều tiết của lực lượng chức năng:</w:t>
+      </w:r>
+      <w:r>
+        <w:rPr>
+          <w:sz w:val="28"/>
+          <w:szCs w:val="28"/>
+        </w:rPr>
+        <w:t xml:space="preserve"> Duy trì phân luồng từ xa liên tục từ 06:00 đến 22:00 hàng ngày tại các giao lộ lớn.</w:t>
+      </w:r>
+    </w:p>
+    <w:p>
+      <w:pPr>
+        <w:rPr>
+          <w:b/>
+          <w:bCs/>
+          <w:sz w:val="28"/>
+          <w:szCs w:val="28"/>
+        </w:rPr>
+      </w:pPr>
+      <w:r>
+        <w:rPr>
+          <w:b/>
+          <w:bCs/>
+          <w:sz w:val="28"/>
+          <w:szCs w:val="28"/>
+        </w:rPr>
+        <w:t>Thời gian ghi nhận số liệu &amp; quy hoạch chiến lược:</w:t>
+      </w:r>
+    </w:p>
+    <w:p>
+      <w:pPr>
+        <w:pStyle w:val="ListParagraph"/>
+        <w:numPr>
+          <w:ilvl w:val="0"/>
+          <w:numId w:val="3"/>
+        </w:numPr>
+        <w:rPr>
+          <w:sz w:val="28"/>
+          <w:szCs w:val="28"/>
+        </w:rPr>
+      </w:pPr>
+      <w:r>
+        <w:rPr>
+          <w:sz w:val="28"/>
+          <w:szCs w:val="28"/>
+        </w:rPr>
+        <w:t>Số liệu thực trạng: Dữ liệu thống kê sự cố ùn ứ ghi nhận trong 9 tháng đầu năm 2024 (và cập nhật các đợt bùng phát ùn tắc giai đoạn 2024–2026).</w:t>
+      </w:r>
+    </w:p>
+    <w:p>
+      <w:pPr>
+        <w:pStyle w:val="ListParagraph"/>
+        <w:numPr>
+          <w:ilvl w:val="0"/>
+          <w:numId w:val="3"/>
+        </w:numPr>
+        <w:rPr>
+          <w:sz w:val="28"/>
+          <w:szCs w:val="28"/>
+        </w:rPr>
+      </w:pPr>
+      <w:r>
+        <w:rPr>
+          <w:sz w:val="28"/>
+          <w:szCs w:val="28"/>
+        </w:rPr>
+        <w:lastRenderedPageBreak/>
+        <w:t>Tầm nhìn quy hoạch &amp; triển khai dự án: Giai đoạn 2025 – 2030 (định hướng giải quyết căn cơ các điểm đen hạ tầng trước năm 2030 và mục tiêu xóa kẹt xe toàn diện đến năm 2035)</w:t>
+      </w:r>
+    </w:p>
+    <w:p>
+      <w:pPr>
+        <w:pStyle w:val="Heading3"/>
+        <w:numPr>
+          <w:ilvl w:val="1"/>
+          <w:numId w:val="1"/>
+        </w:numPr>
+        <w:ind w:hanging="522"/>
+        <w:rPr>
+          <w:color w:val="auto"/>
+        </w:rPr>
+      </w:pPr>
+      <w:r>
+        <w:rPr>
+          <w:color w:val="auto"/>
+        </w:rPr>
+        <w:t>Phạm vi số liệu</w:t>
+      </w:r>
+    </w:p>
+    <w:p>
+      <w:pPr>
+        <w:rPr>
+          <w:b/>
+          <w:bCs/>
+          <w:sz w:val="28"/>
+          <w:szCs w:val="28"/>
+        </w:rPr>
+      </w:pPr>
+      <w:r>
+        <w:rPr>
+          <w:b/>
+          <w:bCs/>
+          <w:sz w:val="28"/>
+          <w:szCs w:val="28"/>
+        </w:rPr>
+        <w:t>Số liệu tần suất ùn ứ (Thống kê 9 tháng/2024):</w:t>
+      </w:r>
+    </w:p>
+    <w:p>
+      <w:pPr>
+        <w:pStyle w:val="ListParagraph"/>
+        <w:numPr>
+          <w:ilvl w:val="0"/>
+          <w:numId w:val="3"/>
+        </w:numPr>
+        <w:rPr>
+          <w:sz w:val="28"/>
+          <w:szCs w:val="28"/>
+        </w:rPr>
+      </w:pPr>
+      <w:r>
+        <w:rPr>
+          <w:sz w:val="28"/>
+          <w:szCs w:val="28"/>
+        </w:rPr>
+        <w:t>Đường Xô Viết Nghệ Tĩnh (đoạn Bạch Đằng – Đài Liệt Sĩ): Ghi nhận 610 – 615 vụ ùn ứ [1].</w:t>
+      </w:r>
+    </w:p>
+    <w:p>
+      <w:pPr>
+        <w:pStyle w:val="ListParagraph"/>
+        <w:numPr>
+          <w:ilvl w:val="0"/>
+          <w:numId w:val="3"/>
+        </w:numPr>
+        <w:rPr>
+          <w:sz w:val="28"/>
+          <w:szCs w:val="28"/>
+        </w:rPr>
+      </w:pPr>
+      <w:r>
+        <w:rPr>
+          <w:sz w:val="28"/>
+          <w:szCs w:val="28"/>
+        </w:rPr>
+        <w:t>Đường Đinh Bộ Lĩnh (giao lộ Bạch Đằng – Đinh Bộ Lĩnh): Ghi nhận 588 – 590 vụ ùn ứ [1].</w:t>
+      </w:r>
+    </w:p>
+    <w:p>
+      <w:pPr>
+        <w:rPr>
+          <w:b/>
+          <w:bCs/>
+          <w:sz w:val="28"/>
+          <w:szCs w:val="28"/>
+        </w:rPr>
+      </w:pPr>
+      <w:r>
+        <w:rPr>
+          <w:b/>
+          <w:bCs/>
+          <w:sz w:val="28"/>
+          <w:szCs w:val="28"/>
+        </w:rPr>
+        <w:t>Số liệu kỹ thuật mặt đường &amp; Quy hoạch mở rộng:</w:t>
+      </w:r>
+    </w:p>
+    <w:p>
+      <w:pPr>
+        <w:pStyle w:val="ListParagraph"/>
+        <w:numPr>
+          <w:ilvl w:val="0"/>
+          <w:numId w:val="3"/>
+        </w:numPr>
+        <w:rPr>
+          <w:sz w:val="28"/>
+          <w:szCs w:val="28"/>
+        </w:rPr>
+      </w:pPr>
+      <w:r>
+        <w:rPr>
+          <w:sz w:val="28"/>
+          <w:szCs w:val="28"/>
+        </w:rPr>
+        <w:t>Đường Xô Viết Nghệ Tĩnh: Bề rộng hiện trạng 16 – 22 m, quy hoạch mở rộng lên 30 – 40 m (quy mô 6–8 làn xe).</w:t>
+      </w:r>
+    </w:p>
+    <w:p>
+      <w:pPr>
+        <w:pStyle w:val="ListParagraph"/>
+        <w:numPr>
+          <w:ilvl w:val="0"/>
+          <w:numId w:val="3"/>
+        </w:numPr>
+        <w:rPr>
+          <w:sz w:val="28"/>
+          <w:szCs w:val="28"/>
+        </w:rPr>
+      </w:pPr>
+      <w:r>
+        <w:rPr>
+          <w:sz w:val="28"/>
+          <w:szCs w:val="28"/>
+        </w:rPr>
+        <w:t>Đường Đinh Bộ Lĩnh: Bề rộng hiện trạng 21 m, quy hoạch mở rộng lên 25 m.</w:t>
+      </w:r>
+    </w:p>
+    <w:p>
+      <w:pPr>
+        <w:pStyle w:val="ListParagraph"/>
+        <w:numPr>
+          <w:ilvl w:val="0"/>
+          <w:numId w:val="3"/>
+        </w:numPr>
+        <w:rPr>
+          <w:sz w:val="28"/>
+          <w:szCs w:val="28"/>
+        </w:rPr>
+      </w:pPr>
+      <w:r>
+        <w:rPr>
+          <w:sz w:val="28"/>
+          <w:szCs w:val="28"/>
+        </w:rPr>
+        <w:t>Đường Ung Văn Khiêm: Chiều dài 1,7 km, quy hoạch mở rộng lên 30 m (6 làn xe).</w:t>
+      </w:r>
+    </w:p>
+    <w:p>
+      <w:pPr>
+        <w:pStyle w:val="ListParagraph"/>
+        <w:numPr>
+          <w:ilvl w:val="0"/>
+          <w:numId w:val="3"/>
+        </w:numPr>
+        <w:rPr>
+          <w:sz w:val="28"/>
+          <w:szCs w:val="28"/>
+        </w:rPr>
+      </w:pPr>
+      <w:r>
+        <w:rPr>
+          <w:sz w:val="28"/>
+          <w:szCs w:val="28"/>
+        </w:rPr>
+        <w:t>Đường Chu Văn An: Quy hoạch mở rộng 25 m, kéo dài thêm 200 – 600 m nối vào nút giao Đài Liệt Sĩ.</w:t>
+      </w:r>
+    </w:p>
+    <w:p>
+      <w:pPr>
+        <w:rPr>
+          <w:b/>
+          <w:bCs/>
+          <w:sz w:val="28"/>
+          <w:szCs w:val="28"/>
+        </w:rPr>
+      </w:pPr>
+      <w:r>
+        <w:rPr>
+          <w:b/>
+          <w:bCs/>
+          <w:sz w:val="28"/>
+          <w:szCs w:val="28"/>
+        </w:rPr>
+        <w:t>Số liệu về dòng xe &amp; thời gian trễ:</w:t>
+      </w:r>
+    </w:p>
+    <w:p>
+      <w:pPr>
+        <w:pStyle w:val="ListParagraph"/>
+        <w:numPr>
+          <w:ilvl w:val="0"/>
+          <w:numId w:val="3"/>
+        </w:numPr>
+        <w:rPr>
+          <w:sz w:val="28"/>
+          <w:szCs w:val="28"/>
+        </w:rPr>
+      </w:pPr>
+      <w:r>
+        <w:rPr>
+          <w:sz w:val="28"/>
+          <w:szCs w:val="28"/>
+        </w:rPr>
+        <w:t>Chiều dài hàng xe ùn tắc khi xảy ra sự cố/mưa lớn: Kéo dài từ 5 đến 10 km dọc trục Điện Biên Phủ ngược về cầu Sài Gòn.</w:t>
+      </w:r>
+    </w:p>
+    <w:p>
+      <w:pPr>
+        <w:pStyle w:val="ListParagraph"/>
+        <w:numPr>
+          <w:ilvl w:val="0"/>
+          <w:numId w:val="3"/>
+        </w:numPr>
+        <w:rPr>
+          <w:sz w:val="28"/>
+          <w:szCs w:val="28"/>
+        </w:rPr>
+      </w:pPr>
+      <w:r>
+        <w:rPr>
+          <w:sz w:val="28"/>
+          <w:szCs w:val="28"/>
+        </w:rPr>
+        <w:t>Tăng thời gian di chuyển do thời tiết: Di chuyển qua đoạn đường Xô Viết Nghệ Tĩnh chỉ dài hơn 1 km tăng từ 10–15 phút lên thành 60–120 phút.</w:t>
+      </w:r>
+    </w:p>
+    <w:p/>
     <w:sectPr>
-      <w:pgSz w:w="11906" w:h="16838" w:code="9"/>
+      <w:pgSz w:w="11906" w:h="16838"/>
       <w:pgMar w:top="1440" w:right="1440" w:bottom="1440" w:left="1440" w:header="720" w:footer="720" w:gutter="0"/>
       <w:cols w:space="720"/>
       <w:docGrid w:linePitch="360"/>
@@ -1926,6 +3320,483 @@
     </w:p>
   </w:footnote>
 </w:footnotes>
+</file>
+
+<file path=word/numbering.xml><?xml version="1.0" encoding="utf-8"?>
+<w:numbering xmlns:wpc="http://schemas.microsoft.com/office/word/2010/wordprocessingCanvas" xmlns:cx="http://schemas.microsoft.com/office/drawing/2014/chartex" xmlns:cx1="http://schemas.microsoft.com/office/drawing/2015/9/8/chartex" xmlns:cx2="http://schemas.microsoft.com/office/drawing/2015/10/21/chartex" xmlns:cx3="http://schemas.microsoft.com/office/drawing/2016/5/9/chartex" xmlns:cx4="http://schemas.microsoft.com/office/drawing/2016/5/10/chartex" xmlns:cx5="http://schemas.microsoft.com/office/drawing/2016/5/11/chartex" xmlns:cx6="http://schemas.microsoft.com/office/drawing/2016/5/12/chartex" xmlns:cx7="http://schemas.microsoft.com/office/drawing/2016/5/13/chartex" xmlns:cx8="http://schemas.microsoft.com/office/drawing/2016/5/14/chartex" xmlns:mc="http://schemas.openxmlformats.org/markup-compatibility/2006" xmlns:aink="http://schemas.microsoft.com/office/drawing/2016/ink" xmlns:am3d="http://schemas.microsoft.com/office/drawing/2017/model3d" xmlns:o="urn:schemas-microsoft-com:office:office" xmlns:oel="http://schemas.microsoft.com/office/2019/extlst" xmlns:r="http://schemas.openxmlformats.org/officeDocument/2006/relationships" xmlns:m="http://schemas.openxmlformats.org/officeDocument/2006/math" xmlns:v="urn:schemas-microsoft-com:vml" xmlns:wp14="http://schemas.microsoft.com/office/word/2010/wordprocessingDrawing" xmlns:wp="http://schemas.openxmlformats.org/drawingml/2006/wordprocessingDrawing" xmlns:w10="urn:schemas-microsoft-com:office:word" xmlns:w="http://schemas.openxmlformats.org/wordprocessingml/2006/main" xmlns:w14="http://schemas.microsoft.com/office/word/2010/wordml" xmlns:w15="http://schemas.microsoft.com/office/word/2012/wordml" xmlns:w16cex="http://schemas.microsoft.com/office/word/2018/wordml/cex" xmlns:w16cid="http://schemas.microsoft.com/office/word/2016/wordml/cid" xmlns:w16="http://schemas.microsoft.com/office/word/2018/wordml" xmlns:w16sdtdh="http://schemas.microsoft.com/office/word/2020/wordml/sdtdatahash" xmlns:w16se="http://schemas.microsoft.com/office/word/2015/wordml/symex" xmlns:wpg="http://schemas.microsoft.com/office/word/2010/wordprocessingGroup" xmlns:wpi="http://schemas.microsoft.com/office/word/2010/wordprocessingInk" xmlns:wne="http://schemas.microsoft.com/office/word/2006/wordml" xmlns:wps="http://schemas.microsoft.com/office/word/2010/wordprocessingShape" mc:Ignorable="w14 w15 w16se w16cid w16 w16cex w16sdtdh wp14">
+  <w:abstractNum w:abstractNumId="0" w15:restartNumberingAfterBreak="0">
+    <w:nsid w:val="0BEB5939"/>
+    <w:multiLevelType w:val="multilevel"/>
+    <w:tmpl w:val="4DB22186"/>
+    <w:lvl w:ilvl="0">
+      <w:start w:val="1"/>
+      <w:numFmt w:val="decimal"/>
+      <w:lvlText w:val="%1."/>
+      <w:lvlJc w:val="left"/>
+      <w:pPr>
+        <w:ind w:left="360" w:hanging="360"/>
+      </w:pPr>
+      <w:rPr>
+        <w:rFonts w:hint="default"/>
+      </w:rPr>
+    </w:lvl>
+    <w:lvl w:ilvl="1">
+      <w:start w:val="1"/>
+      <w:numFmt w:val="decimal"/>
+      <w:lvlText w:val="2.%2."/>
+      <w:lvlJc w:val="left"/>
+      <w:pPr>
+        <w:ind w:left="792" w:hanging="432"/>
+      </w:pPr>
+      <w:rPr>
+        <w:rFonts w:hint="default"/>
+      </w:rPr>
+    </w:lvl>
+    <w:lvl w:ilvl="2">
+      <w:start w:val="1"/>
+      <w:numFmt w:val="decimal"/>
+      <w:lvlText w:val="%1.%2.%3."/>
+      <w:lvlJc w:val="left"/>
+      <w:pPr>
+        <w:ind w:left="1224" w:hanging="504"/>
+      </w:pPr>
+      <w:rPr>
+        <w:rFonts w:hint="default"/>
+      </w:rPr>
+    </w:lvl>
+    <w:lvl w:ilvl="3">
+      <w:start w:val="1"/>
+      <w:numFmt w:val="decimal"/>
+      <w:lvlText w:val="%1.%2.%3.%4."/>
+      <w:lvlJc w:val="left"/>
+      <w:pPr>
+        <w:ind w:left="1728" w:hanging="648"/>
+      </w:pPr>
+      <w:rPr>
+        <w:rFonts w:hint="default"/>
+      </w:rPr>
+    </w:lvl>
+    <w:lvl w:ilvl="4">
+      <w:start w:val="1"/>
+      <w:numFmt w:val="decimal"/>
+      <w:lvlText w:val="%1.%2.%3.%4.%5."/>
+      <w:lvlJc w:val="left"/>
+      <w:pPr>
+        <w:ind w:left="2232" w:hanging="792"/>
+      </w:pPr>
+      <w:rPr>
+        <w:rFonts w:hint="default"/>
+      </w:rPr>
+    </w:lvl>
+    <w:lvl w:ilvl="5">
+      <w:start w:val="1"/>
+      <w:numFmt w:val="decimal"/>
+      <w:lvlText w:val="%1.%2.%3.%4.%5.%6."/>
+      <w:lvlJc w:val="left"/>
+      <w:pPr>
+        <w:ind w:left="2736" w:hanging="936"/>
+      </w:pPr>
+      <w:rPr>
+        <w:rFonts w:hint="default"/>
+      </w:rPr>
+    </w:lvl>
+    <w:lvl w:ilvl="6">
+      <w:start w:val="1"/>
+      <w:numFmt w:val="decimal"/>
+      <w:lvlText w:val="%1.%2.%3.%4.%5.%6.%7."/>
+      <w:lvlJc w:val="left"/>
+      <w:pPr>
+        <w:ind w:left="3240" w:hanging="1080"/>
+      </w:pPr>
+      <w:rPr>
+        <w:rFonts w:hint="default"/>
+      </w:rPr>
+    </w:lvl>
+    <w:lvl w:ilvl="7">
+      <w:start w:val="1"/>
+      <w:numFmt w:val="decimal"/>
+      <w:lvlText w:val="%1.%2.%3.%4.%5.%6.%7.%8."/>
+      <w:lvlJc w:val="left"/>
+      <w:pPr>
+        <w:ind w:left="3744" w:hanging="1224"/>
+      </w:pPr>
+      <w:rPr>
+        <w:rFonts w:hint="default"/>
+      </w:rPr>
+    </w:lvl>
+    <w:lvl w:ilvl="8">
+      <w:start w:val="1"/>
+      <w:numFmt w:val="decimal"/>
+      <w:lvlText w:val="%1.%2.%3.%4.%5.%6.%7.%8.%9."/>
+      <w:lvlJc w:val="left"/>
+      <w:pPr>
+        <w:ind w:left="4320" w:hanging="1440"/>
+      </w:pPr>
+      <w:rPr>
+        <w:rFonts w:hint="default"/>
+      </w:rPr>
+    </w:lvl>
+  </w:abstractNum>
+  <w:abstractNum w:abstractNumId="1" w15:restartNumberingAfterBreak="0">
+    <w:nsid w:val="12A85F01"/>
+    <w:multiLevelType w:val="hybridMultilevel"/>
+    <w:tmpl w:val="6380C43C"/>
+    <w:lvl w:ilvl="0" w:tplc="78D62972">
+      <w:start w:val="2"/>
+      <w:numFmt w:val="bullet"/>
+      <w:lvlText w:val="-"/>
+      <w:lvlJc w:val="left"/>
+      <w:pPr>
+        <w:ind w:left="720" w:hanging="360"/>
+      </w:pPr>
+      <w:rPr>
+        <w:rFonts w:ascii="Times New Roman" w:eastAsiaTheme="minorEastAsia" w:hAnsi="Times New Roman" w:cs="Times New Roman" w:hint="default"/>
+      </w:rPr>
+    </w:lvl>
+    <w:lvl w:ilvl="1" w:tplc="04090003" w:tentative="1">
+      <w:start w:val="1"/>
+      <w:numFmt w:val="bullet"/>
+      <w:lvlText w:val="o"/>
+      <w:lvlJc w:val="left"/>
+      <w:pPr>
+        <w:ind w:left="1440" w:hanging="360"/>
+      </w:pPr>
+      <w:rPr>
+        <w:rFonts w:ascii="Courier New" w:hAnsi="Courier New" w:cs="Courier New" w:hint="default"/>
+      </w:rPr>
+    </w:lvl>
+    <w:lvl w:ilvl="2" w:tplc="04090005" w:tentative="1">
+      <w:start w:val="1"/>
+      <w:numFmt w:val="bullet"/>
+      <w:lvlText w:val=""/>
+      <w:lvlJc w:val="left"/>
+      <w:pPr>
+        <w:ind w:left="2160" w:hanging="360"/>
+      </w:pPr>
+      <w:rPr>
+        <w:rFonts w:ascii="Wingdings" w:hAnsi="Wingdings" w:hint="default"/>
+      </w:rPr>
+    </w:lvl>
+    <w:lvl w:ilvl="3" w:tplc="04090001" w:tentative="1">
+      <w:start w:val="1"/>
+      <w:numFmt w:val="bullet"/>
+      <w:lvlText w:val=""/>
+      <w:lvlJc w:val="left"/>
+      <w:pPr>
+        <w:ind w:left="2880" w:hanging="360"/>
+      </w:pPr>
+      <w:rPr>
+        <w:rFonts w:ascii="Symbol" w:hAnsi="Symbol" w:hint="default"/>
+      </w:rPr>
+    </w:lvl>
+    <w:lvl w:ilvl="4" w:tplc="04090003" w:tentative="1">
+      <w:start w:val="1"/>
+      <w:numFmt w:val="bullet"/>
+      <w:lvlText w:val="o"/>
+      <w:lvlJc w:val="left"/>
+      <w:pPr>
+        <w:ind w:left="3600" w:hanging="360"/>
+      </w:pPr>
+      <w:rPr>
+        <w:rFonts w:ascii="Courier New" w:hAnsi="Courier New" w:cs="Courier New" w:hint="default"/>
+      </w:rPr>
+    </w:lvl>
+    <w:lvl w:ilvl="5" w:tplc="04090005" w:tentative="1">
+      <w:start w:val="1"/>
+      <w:numFmt w:val="bullet"/>
+      <w:lvlText w:val=""/>
+      <w:lvlJc w:val="left"/>
+      <w:pPr>
+        <w:ind w:left="4320" w:hanging="360"/>
+      </w:pPr>
+      <w:rPr>
+        <w:rFonts w:ascii="Wingdings" w:hAnsi="Wingdings" w:hint="default"/>
+      </w:rPr>
+    </w:lvl>
+    <w:lvl w:ilvl="6" w:tplc="04090001" w:tentative="1">
+      <w:start w:val="1"/>
+      <w:numFmt w:val="bullet"/>
+      <w:lvlText w:val=""/>
+      <w:lvlJc w:val="left"/>
+      <w:pPr>
+        <w:ind w:left="5040" w:hanging="360"/>
+      </w:pPr>
+      <w:rPr>
+        <w:rFonts w:ascii="Symbol" w:hAnsi="Symbol" w:hint="default"/>
+      </w:rPr>
+    </w:lvl>
+    <w:lvl w:ilvl="7" w:tplc="04090003" w:tentative="1">
+      <w:start w:val="1"/>
+      <w:numFmt w:val="bullet"/>
+      <w:lvlText w:val="o"/>
+      <w:lvlJc w:val="left"/>
+      <w:pPr>
+        <w:ind w:left="5760" w:hanging="360"/>
+      </w:pPr>
+      <w:rPr>
+        <w:rFonts w:ascii="Courier New" w:hAnsi="Courier New" w:cs="Courier New" w:hint="default"/>
+      </w:rPr>
+    </w:lvl>
+    <w:lvl w:ilvl="8" w:tplc="04090005" w:tentative="1">
+      <w:start w:val="1"/>
+      <w:numFmt w:val="bullet"/>
+      <w:lvlText w:val=""/>
+      <w:lvlJc w:val="left"/>
+      <w:pPr>
+        <w:ind w:left="6480" w:hanging="360"/>
+      </w:pPr>
+      <w:rPr>
+        <w:rFonts w:ascii="Wingdings" w:hAnsi="Wingdings" w:hint="default"/>
+      </w:rPr>
+    </w:lvl>
+  </w:abstractNum>
+  <w:abstractNum w:abstractNumId="2" w15:restartNumberingAfterBreak="0">
+    <w:nsid w:val="6E3D5E3C"/>
+    <w:multiLevelType w:val="hybridMultilevel"/>
+    <w:tmpl w:val="3C46B356"/>
+    <w:lvl w:ilvl="0" w:tplc="43F6A05A">
+      <w:start w:val="2"/>
+      <w:numFmt w:val="bullet"/>
+      <w:lvlText w:val="-"/>
+      <w:lvlJc w:val="left"/>
+      <w:pPr>
+        <w:ind w:left="720" w:hanging="360"/>
+      </w:pPr>
+      <w:rPr>
+        <w:rFonts w:ascii="Times New Roman" w:eastAsiaTheme="minorEastAsia" w:hAnsi="Times New Roman" w:cs="Times New Roman" w:hint="default"/>
+      </w:rPr>
+    </w:lvl>
+    <w:lvl w:ilvl="1" w:tplc="04090003" w:tentative="1">
+      <w:start w:val="1"/>
+      <w:numFmt w:val="bullet"/>
+      <w:lvlText w:val="o"/>
+      <w:lvlJc w:val="left"/>
+      <w:pPr>
+        <w:ind w:left="1440" w:hanging="360"/>
+      </w:pPr>
+      <w:rPr>
+        <w:rFonts w:ascii="Courier New" w:hAnsi="Courier New" w:cs="Courier New" w:hint="default"/>
+      </w:rPr>
+    </w:lvl>
+    <w:lvl w:ilvl="2" w:tplc="04090005" w:tentative="1">
+      <w:start w:val="1"/>
+      <w:numFmt w:val="bullet"/>
+      <w:lvlText w:val=""/>
+      <w:lvlJc w:val="left"/>
+      <w:pPr>
+        <w:ind w:left="2160" w:hanging="360"/>
+      </w:pPr>
+      <w:rPr>
+        <w:rFonts w:ascii="Wingdings" w:hAnsi="Wingdings" w:hint="default"/>
+      </w:rPr>
+    </w:lvl>
+    <w:lvl w:ilvl="3" w:tplc="04090001" w:tentative="1">
+      <w:start w:val="1"/>
+      <w:numFmt w:val="bullet"/>
+      <w:lvlText w:val=""/>
+      <w:lvlJc w:val="left"/>
+      <w:pPr>
+        <w:ind w:left="2880" w:hanging="360"/>
+      </w:pPr>
+      <w:rPr>
+        <w:rFonts w:ascii="Symbol" w:hAnsi="Symbol" w:hint="default"/>
+      </w:rPr>
+    </w:lvl>
+    <w:lvl w:ilvl="4" w:tplc="04090003" w:tentative="1">
+      <w:start w:val="1"/>
+      <w:numFmt w:val="bullet"/>
+      <w:lvlText w:val="o"/>
+      <w:lvlJc w:val="left"/>
+      <w:pPr>
+        <w:ind w:left="3600" w:hanging="360"/>
+      </w:pPr>
+      <w:rPr>
+        <w:rFonts w:ascii="Courier New" w:hAnsi="Courier New" w:cs="Courier New" w:hint="default"/>
+      </w:rPr>
+    </w:lvl>
+    <w:lvl w:ilvl="5" w:tplc="04090005" w:tentative="1">
+      <w:start w:val="1"/>
+      <w:numFmt w:val="bullet"/>
+      <w:lvlText w:val=""/>
+      <w:lvlJc w:val="left"/>
+      <w:pPr>
+        <w:ind w:left="4320" w:hanging="360"/>
+      </w:pPr>
+      <w:rPr>
+        <w:rFonts w:ascii="Wingdings" w:hAnsi="Wingdings" w:hint="default"/>
+      </w:rPr>
+    </w:lvl>
+    <w:lvl w:ilvl="6" w:tplc="04090001" w:tentative="1">
+      <w:start w:val="1"/>
+      <w:numFmt w:val="bullet"/>
+      <w:lvlText w:val=""/>
+      <w:lvlJc w:val="left"/>
+      <w:pPr>
+        <w:ind w:left="5040" w:hanging="360"/>
+      </w:pPr>
+      <w:rPr>
+        <w:rFonts w:ascii="Symbol" w:hAnsi="Symbol" w:hint="default"/>
+      </w:rPr>
+    </w:lvl>
+    <w:lvl w:ilvl="7" w:tplc="04090003" w:tentative="1">
+      <w:start w:val="1"/>
+      <w:numFmt w:val="bullet"/>
+      <w:lvlText w:val="o"/>
+      <w:lvlJc w:val="left"/>
+      <w:pPr>
+        <w:ind w:left="5760" w:hanging="360"/>
+      </w:pPr>
+      <w:rPr>
+        <w:rFonts w:ascii="Courier New" w:hAnsi="Courier New" w:cs="Courier New" w:hint="default"/>
+      </w:rPr>
+    </w:lvl>
+    <w:lvl w:ilvl="8" w:tplc="04090005" w:tentative="1">
+      <w:start w:val="1"/>
+      <w:numFmt w:val="bullet"/>
+      <w:lvlText w:val=""/>
+      <w:lvlJc w:val="left"/>
+      <w:pPr>
+        <w:ind w:left="6480" w:hanging="360"/>
+      </w:pPr>
+      <w:rPr>
+        <w:rFonts w:ascii="Wingdings" w:hAnsi="Wingdings" w:hint="default"/>
+      </w:rPr>
+    </w:lvl>
+  </w:abstractNum>
+  <w:abstractNum w:abstractNumId="3" w15:restartNumberingAfterBreak="0">
+    <w:nsid w:val="79B903C5"/>
+    <w:multiLevelType w:val="multilevel"/>
+    <w:tmpl w:val="0D3E5024"/>
+    <w:lvl w:ilvl="0">
+      <w:start w:val="1"/>
+      <w:numFmt w:val="decimal"/>
+      <w:lvlText w:val="%1."/>
+      <w:lvlJc w:val="left"/>
+      <w:pPr>
+        <w:ind w:left="432" w:hanging="360"/>
+      </w:pPr>
+      <w:rPr>
+        <w:rFonts w:hint="default"/>
+      </w:rPr>
+    </w:lvl>
+    <w:lvl w:ilvl="1">
+      <w:start w:val="1"/>
+      <w:numFmt w:val="decimal"/>
+      <w:isLgl/>
+      <w:lvlText w:val="%1.%2."/>
+      <w:lvlJc w:val="left"/>
+      <w:pPr>
+        <w:ind w:left="792" w:hanging="720"/>
+      </w:pPr>
+      <w:rPr>
+        <w:rFonts w:hint="default"/>
+      </w:rPr>
+    </w:lvl>
+    <w:lvl w:ilvl="2">
+      <w:start w:val="1"/>
+      <w:numFmt w:val="decimal"/>
+      <w:isLgl/>
+      <w:lvlText w:val="%1.%2.%3."/>
+      <w:lvlJc w:val="left"/>
+      <w:pPr>
+        <w:ind w:left="792" w:hanging="720"/>
+      </w:pPr>
+      <w:rPr>
+        <w:rFonts w:hint="default"/>
+      </w:rPr>
+    </w:lvl>
+    <w:lvl w:ilvl="3">
+      <w:start w:val="1"/>
+      <w:numFmt w:val="decimal"/>
+      <w:isLgl/>
+      <w:lvlText w:val="%1.%2.%3.%4."/>
+      <w:lvlJc w:val="left"/>
+      <w:pPr>
+        <w:ind w:left="1152" w:hanging="1080"/>
+      </w:pPr>
+      <w:rPr>
+        <w:rFonts w:hint="default"/>
+      </w:rPr>
+    </w:lvl>
+    <w:lvl w:ilvl="4">
+      <w:start w:val="1"/>
+      <w:numFmt w:val="decimal"/>
+      <w:isLgl/>
+      <w:lvlText w:val="%1.%2.%3.%4.%5."/>
+      <w:lvlJc w:val="left"/>
+      <w:pPr>
+        <w:ind w:left="1152" w:hanging="1080"/>
+      </w:pPr>
+      <w:rPr>
+        <w:rFonts w:hint="default"/>
+      </w:rPr>
+    </w:lvl>
+    <w:lvl w:ilvl="5">
+      <w:start w:val="1"/>
+      <w:numFmt w:val="decimal"/>
+      <w:isLgl/>
+      <w:lvlText w:val="%1.%2.%3.%4.%5.%6."/>
+      <w:lvlJc w:val="left"/>
+      <w:pPr>
+        <w:ind w:left="1512" w:hanging="1440"/>
+      </w:pPr>
+      <w:rPr>
+        <w:rFonts w:hint="default"/>
+      </w:rPr>
+    </w:lvl>
+    <w:lvl w:ilvl="6">
+      <w:start w:val="1"/>
+      <w:numFmt w:val="decimal"/>
+      <w:isLgl/>
+      <w:lvlText w:val="%1.%2.%3.%4.%5.%6.%7."/>
+      <w:lvlJc w:val="left"/>
+      <w:pPr>
+        <w:ind w:left="1872" w:hanging="1800"/>
+      </w:pPr>
+      <w:rPr>
+        <w:rFonts w:hint="default"/>
+      </w:rPr>
+    </w:lvl>
+    <w:lvl w:ilvl="7">
+      <w:start w:val="1"/>
+      <w:numFmt w:val="decimal"/>
+      <w:isLgl/>
+      <w:lvlText w:val="%1.%2.%3.%4.%5.%6.%7.%8."/>
+      <w:lvlJc w:val="left"/>
+      <w:pPr>
+        <w:ind w:left="1872" w:hanging="1800"/>
+      </w:pPr>
+      <w:rPr>
+        <w:rFonts w:hint="default"/>
+      </w:rPr>
+    </w:lvl>
+    <w:lvl w:ilvl="8">
+      <w:start w:val="1"/>
+      <w:numFmt w:val="decimal"/>
+      <w:isLgl/>
+      <w:lvlText w:val="%1.%2.%3.%4.%5.%6.%7.%8.%9."/>
+      <w:lvlJc w:val="left"/>
+      <w:pPr>
+        <w:ind w:left="2232" w:hanging="2160"/>
+      </w:pPr>
+      <w:rPr>
+        <w:rFonts w:hint="default"/>
+      </w:rPr>
+    </w:lvl>
+  </w:abstractNum>
+  <w:num w:numId="1" w16cid:durableId="732118757">
+    <w:abstractNumId w:val="3"/>
+  </w:num>
+  <w:num w:numId="2" w16cid:durableId="1971012642">
+    <w:abstractNumId w:val="2"/>
+  </w:num>
+  <w:num w:numId="3" w16cid:durableId="1259295016">
+    <w:abstractNumId w:val="1"/>
+  </w:num>
+  <w:num w:numId="4" w16cid:durableId="1525365053">
+    <w:abstractNumId w:val="0"/>
+  </w:num>
+</w:numbering>
 </file>
 
 <file path=word/styles.xml><?xml version="1.0" encoding="utf-8"?>
@@ -1971,8 +3842,8 @@
     <w:lsdException w:name="Normal Indent" w:semiHidden="1" w:unhideWhenUsed="1"/>
     <w:lsdException w:name="footnote text" w:semiHidden="1" w:unhideWhenUsed="1"/>
     <w:lsdException w:name="annotation text" w:semiHidden="1" w:unhideWhenUsed="1"/>
-    <w:lsdException w:name="header" w:semiHidden="1" w:unhideWhenUsed="1"/>
-    <w:lsdException w:name="footer" w:semiHidden="1" w:unhideWhenUsed="1"/>
+    <w:lsdException w:name="header" w:unhideWhenUsed="1" w:qFormat="1"/>
+    <w:lsdException w:name="footer" w:unhideWhenUsed="1" w:qFormat="1"/>
     <w:lsdException w:name="index heading" w:semiHidden="1" w:unhideWhenUsed="1"/>
     <w:lsdException w:name="caption" w:uiPriority="35" w:unhideWhenUsed="1" w:qFormat="1"/>
     <w:lsdException w:name="table of figures" w:unhideWhenUsed="1" w:qFormat="1"/>
@@ -2105,13 +3976,13 @@
     <w:lsdException w:name="Medium Shading 2" w:uiPriority="64"/>
     <w:lsdException w:name="Medium List 1" w:uiPriority="65"/>
     <w:lsdException w:name="Medium List 2" w:uiPriority="66"/>
-    <w:lsdException w:name="Medium Grid 1" w:uiPriority="67" w:qFormat="1"/>
-    <w:lsdException w:name="Medium Grid 2" w:uiPriority="68" w:qFormat="1"/>
-    <w:lsdException w:name="Medium Grid 3" w:uiPriority="69" w:qFormat="1"/>
+    <w:lsdException w:name="Medium Grid 1" w:uiPriority="67"/>
+    <w:lsdException w:name="Medium Grid 2" w:uiPriority="68"/>
+    <w:lsdException w:name="Medium Grid 3" w:uiPriority="69"/>
     <w:lsdException w:name="Dark List" w:uiPriority="70"/>
     <w:lsdException w:name="Colorful Shading" w:uiPriority="71"/>
-    <w:lsdException w:name="Colorful List" w:uiPriority="72" w:qFormat="1"/>
-    <w:lsdException w:name="Colorful Grid" w:uiPriority="73" w:qFormat="1"/>
+    <w:lsdException w:name="Colorful List" w:uiPriority="72"/>
+    <w:lsdException w:name="Colorful Grid" w:uiPriority="73"/>
     <w:lsdException w:name="Light Shading Accent 1" w:uiPriority="60"/>
     <w:lsdException w:name="Light List Accent 1" w:uiPriority="61"/>
     <w:lsdException w:name="Light Grid Accent 1" w:uiPriority="62"/>
@@ -2124,11 +3995,11 @@
     <w:lsdException w:name="Intense Quote" w:uiPriority="30" w:qFormat="1"/>
     <w:lsdException w:name="Medium List 2 Accent 1" w:uiPriority="66"/>
     <w:lsdException w:name="Medium Grid 1 Accent 1" w:uiPriority="67"/>
-    <w:lsdException w:name="Medium Grid 2 Accent 1" w:uiPriority="68" w:qFormat="1"/>
+    <w:lsdException w:name="Medium Grid 2 Accent 1" w:uiPriority="68"/>
     <w:lsdException w:name="Medium Grid 3 Accent 1" w:uiPriority="69"/>
     <w:lsdException w:name="Dark List Accent 1" w:uiPriority="70"/>
-    <w:lsdException w:name="Colorful Shading Accent 1" w:uiPriority="71" w:qFormat="1"/>
-    <w:lsdException w:name="Colorful List Accent 1" w:uiPriority="72" w:qFormat="1"/>
+    <w:lsdException w:name="Colorful Shading Accent 1" w:uiPriority="71"/>
+    <w:lsdException w:name="Colorful List Accent 1" w:uiPriority="72"/>
     <w:lsdException w:name="Colorful Grid Accent 1" w:uiPriority="73"/>
     <w:lsdException w:name="Light Shading Accent 2" w:uiPriority="60"/>
     <w:lsdException w:name="Light List Accent 2" w:uiPriority="61"/>
@@ -2136,14 +4007,14 @@
     <w:lsdException w:name="Medium Shading 1 Accent 2" w:uiPriority="63"/>
     <w:lsdException w:name="Medium Shading 2 Accent 2" w:uiPriority="64"/>
     <w:lsdException w:name="Medium List 1 Accent 2" w:uiPriority="65"/>
-    <w:lsdException w:name="Medium List 2 Accent 2" w:uiPriority="66" w:qFormat="1"/>
+    <w:lsdException w:name="Medium List 2 Accent 2" w:uiPriority="66"/>
     <w:lsdException w:name="Medium Grid 1 Accent 2" w:uiPriority="67"/>
     <w:lsdException w:name="Medium Grid 2 Accent 2" w:uiPriority="68"/>
     <w:lsdException w:name="Medium Grid 3 Accent 2" w:uiPriority="69"/>
-    <w:lsdException w:name="Dark List Accent 2" w:uiPriority="70" w:qFormat="1"/>
-    <w:lsdException w:name="Colorful Shading Accent 2" w:uiPriority="71" w:qFormat="1"/>
-    <w:lsdException w:name="Colorful List Accent 2" w:uiPriority="72" w:qFormat="1"/>
-    <w:lsdException w:name="Colorful Grid Accent 2" w:uiPriority="73" w:qFormat="1"/>
+    <w:lsdException w:name="Dark List Accent 2" w:uiPriority="70"/>
+    <w:lsdException w:name="Colorful Shading Accent 2" w:uiPriority="71"/>
+    <w:lsdException w:name="Colorful List Accent 2" w:uiPriority="72"/>
+    <w:lsdException w:name="Colorful Grid Accent 2" w:uiPriority="73"/>
     <w:lsdException w:name="Light Shading Accent 3" w:uiPriority="60"/>
     <w:lsdException w:name="Light List Accent 3" w:uiPriority="61"/>
     <w:lsdException w:name="Light Grid Accent 3" w:uiPriority="62"/>
@@ -2151,40 +4022,40 @@
     <w:lsdException w:name="Medium Shading 2 Accent 3" w:uiPriority="64"/>
     <w:lsdException w:name="Medium List 1 Accent 3" w:uiPriority="65"/>
     <w:lsdException w:name="Medium List 2 Accent 3" w:uiPriority="66"/>
-    <w:lsdException w:name="Medium Grid 1 Accent 3" w:uiPriority="67" w:qFormat="1"/>
+    <w:lsdException w:name="Medium Grid 1 Accent 3" w:uiPriority="67"/>
     <w:lsdException w:name="Medium Grid 2 Accent 3" w:uiPriority="68"/>
     <w:lsdException w:name="Medium Grid 3 Accent 3" w:uiPriority="69"/>
     <w:lsdException w:name="Dark List Accent 3" w:uiPriority="70"/>
     <w:lsdException w:name="Colorful Shading Accent 3" w:uiPriority="71"/>
-    <w:lsdException w:name="Colorful List Accent 3" w:uiPriority="72" w:qFormat="1"/>
-    <w:lsdException w:name="Colorful Grid Accent 3" w:uiPriority="73" w:qFormat="1"/>
+    <w:lsdException w:name="Colorful List Accent 3" w:uiPriority="72"/>
+    <w:lsdException w:name="Colorful Grid Accent 3" w:uiPriority="73"/>
     <w:lsdException w:name="Light Shading Accent 4" w:uiPriority="60"/>
     <w:lsdException w:name="Light List Accent 4" w:uiPriority="61"/>
     <w:lsdException w:name="Light Grid Accent 4" w:uiPriority="62"/>
     <w:lsdException w:name="Medium Shading 1 Accent 4" w:uiPriority="63"/>
     <w:lsdException w:name="Medium Shading 2 Accent 4" w:uiPriority="64"/>
     <w:lsdException w:name="Medium List 1 Accent 4" w:uiPriority="65"/>
-    <w:lsdException w:name="Medium List 2 Accent 4" w:uiPriority="66" w:qFormat="1"/>
+    <w:lsdException w:name="Medium List 2 Accent 4" w:uiPriority="66"/>
     <w:lsdException w:name="Medium Grid 1 Accent 4" w:uiPriority="67"/>
-    <w:lsdException w:name="Medium Grid 2 Accent 4" w:uiPriority="68" w:qFormat="1"/>
+    <w:lsdException w:name="Medium Grid 2 Accent 4" w:uiPriority="68"/>
     <w:lsdException w:name="Medium Grid 3 Accent 4" w:uiPriority="69"/>
-    <w:lsdException w:name="Dark List Accent 4" w:uiPriority="70" w:qFormat="1"/>
-    <w:lsdException w:name="Colorful Shading Accent 4" w:uiPriority="71" w:qFormat="1"/>
-    <w:lsdException w:name="Colorful List Accent 4" w:uiPriority="72" w:qFormat="1"/>
+    <w:lsdException w:name="Dark List Accent 4" w:uiPriority="70"/>
+    <w:lsdException w:name="Colorful Shading Accent 4" w:uiPriority="71"/>
+    <w:lsdException w:name="Colorful List Accent 4" w:uiPriority="72"/>
     <w:lsdException w:name="Colorful Grid Accent 4" w:uiPriority="73"/>
     <w:lsdException w:name="Light Shading Accent 5" w:uiPriority="60"/>
     <w:lsdException w:name="Light List Accent 5" w:uiPriority="61"/>
     <w:lsdException w:name="Light Grid Accent 5" w:uiPriority="62"/>
     <w:lsdException w:name="Medium Shading 1 Accent 5" w:uiPriority="63"/>
     <w:lsdException w:name="Medium Shading 2 Accent 5" w:uiPriority="64"/>
-    <w:lsdException w:name="Medium List 1 Accent 5" w:uiPriority="65" w:qFormat="1"/>
+    <w:lsdException w:name="Medium List 1 Accent 5" w:uiPriority="65"/>
     <w:lsdException w:name="Medium List 2 Accent 5" w:uiPriority="66"/>
-    <w:lsdException w:name="Medium Grid 1 Accent 5" w:uiPriority="67" w:qFormat="1"/>
-    <w:lsdException w:name="Medium Grid 2 Accent 5" w:uiPriority="68" w:qFormat="1"/>
+    <w:lsdException w:name="Medium Grid 1 Accent 5" w:uiPriority="67"/>
+    <w:lsdException w:name="Medium Grid 2 Accent 5" w:uiPriority="68"/>
     <w:lsdException w:name="Medium Grid 3 Accent 5" w:uiPriority="69"/>
     <w:lsdException w:name="Dark List Accent 5" w:uiPriority="70"/>
-    <w:lsdException w:name="Colorful Shading Accent 5" w:uiPriority="71" w:qFormat="1"/>
-    <w:lsdException w:name="Colorful List Accent 5" w:uiPriority="72" w:qFormat="1"/>
+    <w:lsdException w:name="Colorful Shading Accent 5" w:uiPriority="71"/>
+    <w:lsdException w:name="Colorful List Accent 5" w:uiPriority="72"/>
     <w:lsdException w:name="Colorful Grid Accent 5" w:uiPriority="73"/>
     <w:lsdException w:name="Light Shading Accent 6" w:uiPriority="60"/>
     <w:lsdException w:name="Light List Accent 6" w:uiPriority="61"/>
@@ -2192,14 +4063,14 @@
     <w:lsdException w:name="Medium Shading 1 Accent 6" w:uiPriority="63"/>
     <w:lsdException w:name="Medium Shading 2 Accent 6" w:uiPriority="64"/>
     <w:lsdException w:name="Medium List 1 Accent 6" w:uiPriority="65"/>
-    <w:lsdException w:name="Medium List 2 Accent 6" w:uiPriority="66" w:qFormat="1"/>
+    <w:lsdException w:name="Medium List 2 Accent 6" w:uiPriority="66"/>
     <w:lsdException w:name="Medium Grid 1 Accent 6" w:uiPriority="67"/>
     <w:lsdException w:name="Medium Grid 2 Accent 6" w:uiPriority="68"/>
     <w:lsdException w:name="Medium Grid 3 Accent 6" w:uiPriority="69"/>
     <w:lsdException w:name="Dark List Accent 6" w:uiPriority="70"/>
-    <w:lsdException w:name="Colorful Shading Accent 6" w:uiPriority="71" w:qFormat="1"/>
-    <w:lsdException w:name="Colorful List Accent 6" w:uiPriority="72" w:qFormat="1"/>
-    <w:lsdException w:name="Colorful Grid Accent 6" w:uiPriority="73" w:qFormat="1"/>
+    <w:lsdException w:name="Colorful Shading Accent 6" w:uiPriority="71"/>
+    <w:lsdException w:name="Colorful List Accent 6" w:uiPriority="72"/>
+    <w:lsdException w:name="Colorful Grid Accent 6" w:uiPriority="73"/>
     <w:lsdException w:name="Subtle Emphasis" w:uiPriority="19" w:qFormat="1"/>
     <w:lsdException w:name="Intense Emphasis" w:uiPriority="21" w:qFormat="1"/>
     <w:lsdException w:name="Subtle Reference" w:uiPriority="31" w:qFormat="1"/>
@@ -2355,7 +4226,6 @@
     <w:next w:val="Normal"/>
     <w:link w:val="Heading2Char"/>
     <w:uiPriority w:val="9"/>
-    <w:semiHidden/>
     <w:unhideWhenUsed/>
     <w:qFormat/>
     <w:pPr>
@@ -2377,7 +4247,6 @@
     <w:next w:val="Normal"/>
     <w:link w:val="Heading3Char"/>
     <w:uiPriority w:val="9"/>
-    <w:semiHidden/>
     <w:unhideWhenUsed/>
     <w:qFormat/>
     <w:pPr>
@@ -2563,6 +4432,36 @@
       <w:szCs w:val="18"/>
     </w:rPr>
   </w:style>
+  <w:style w:type="paragraph" w:styleId="Footer">
+    <w:name w:val="footer"/>
+    <w:basedOn w:val="Normal"/>
+    <w:link w:val="FooterChar"/>
+    <w:uiPriority w:val="99"/>
+    <w:unhideWhenUsed/>
+    <w:qFormat/>
+    <w:pPr>
+      <w:tabs>
+        <w:tab w:val="center" w:pos="4680"/>
+        <w:tab w:val="right" w:pos="9360"/>
+      </w:tabs>
+      <w:spacing w:after="0" w:line="240" w:lineRule="auto"/>
+    </w:pPr>
+  </w:style>
+  <w:style w:type="paragraph" w:styleId="Header">
+    <w:name w:val="header"/>
+    <w:basedOn w:val="Normal"/>
+    <w:link w:val="HeaderChar"/>
+    <w:uiPriority w:val="99"/>
+    <w:unhideWhenUsed/>
+    <w:qFormat/>
+    <w:pPr>
+      <w:tabs>
+        <w:tab w:val="center" w:pos="4680"/>
+        <w:tab w:val="right" w:pos="9360"/>
+      </w:tabs>
+      <w:spacing w:after="0" w:line="240" w:lineRule="auto"/>
+    </w:pPr>
+  </w:style>
   <w:style w:type="character" w:styleId="Hyperlink">
     <w:name w:val="Hyperlink"/>
     <w:basedOn w:val="DefaultParagraphFont"/>
@@ -2706,7 +4605,6 @@
     <w:basedOn w:val="DefaultParagraphFont"/>
     <w:link w:val="Heading2"/>
     <w:uiPriority w:val="9"/>
-    <w:semiHidden/>
     <w:qFormat/>
     <w:rPr>
       <w:rFonts w:asciiTheme="majorHAnsi" w:eastAsiaTheme="majorEastAsia" w:hAnsiTheme="majorHAnsi" w:cstheme="majorBidi"/>
@@ -2720,7 +4618,6 @@
     <w:basedOn w:val="DefaultParagraphFont"/>
     <w:link w:val="Heading3"/>
     <w:uiPriority w:val="9"/>
-    <w:semiHidden/>
     <w:qFormat/>
     <w:rPr>
       <w:rFonts w:eastAsiaTheme="majorEastAsia" w:cstheme="majorBidi"/>
@@ -2932,68 +4829,36 @@
       <w:spacing w:val="5"/>
     </w:rPr>
   </w:style>
-  <w:style w:type="paragraph" w:styleId="Header">
-    <w:name w:val="header"/>
-    <w:basedOn w:val="Normal"/>
-    <w:link w:val="HeaderChar"/>
-    <w:uiPriority w:val="99"/>
-    <w:unhideWhenUsed/>
-    <w:rsid w:val="00D41581"/>
-    <w:pPr>
-      <w:tabs>
-        <w:tab w:val="center" w:pos="4680"/>
-        <w:tab w:val="right" w:pos="9360"/>
-      </w:tabs>
-      <w:spacing w:after="0" w:line="240" w:lineRule="auto"/>
-    </w:pPr>
-  </w:style>
   <w:style w:type="character" w:customStyle="1" w:styleId="HeaderChar">
     <w:name w:val="Header Char"/>
     <w:basedOn w:val="DefaultParagraphFont"/>
     <w:link w:val="Header"/>
     <w:uiPriority w:val="99"/>
-    <w:rsid w:val="00D41581"/>
     <w:rPr>
       <w:rFonts w:eastAsiaTheme="minorEastAsia" w:cstheme="minorBidi"/>
       <w:sz w:val="26"/>
       <w:szCs w:val="22"/>
     </w:rPr>
   </w:style>
-  <w:style w:type="paragraph" w:styleId="Footer">
-    <w:name w:val="footer"/>
-    <w:basedOn w:val="Normal"/>
-    <w:link w:val="FooterChar"/>
-    <w:uiPriority w:val="99"/>
-    <w:unhideWhenUsed/>
-    <w:rsid w:val="00D41581"/>
-    <w:pPr>
-      <w:tabs>
-        <w:tab w:val="center" w:pos="4680"/>
-        <w:tab w:val="right" w:pos="9360"/>
-      </w:tabs>
-      <w:spacing w:after="0" w:line="240" w:lineRule="auto"/>
-    </w:pPr>
-  </w:style>
   <w:style w:type="character" w:customStyle="1" w:styleId="FooterChar">
     <w:name w:val="Footer Char"/>
     <w:basedOn w:val="DefaultParagraphFont"/>
     <w:link w:val="Footer"/>
     <w:uiPriority w:val="99"/>
-    <w:rsid w:val="00D41581"/>
+    <w:qFormat/>
     <w:rPr>
       <w:rFonts w:eastAsiaTheme="minorEastAsia" w:cstheme="minorBidi"/>
       <w:sz w:val="26"/>
       <w:szCs w:val="22"/>
     </w:rPr>
   </w:style>
-  <w:style w:type="paragraph" w:styleId="TOCHeading">
-    <w:name w:val="TOC Heading"/>
+  <w:style w:type="paragraph" w:customStyle="1" w:styleId="TOCHeading1">
+    <w:name w:val="TOC Heading1"/>
     <w:basedOn w:val="Heading1"/>
     <w:next w:val="Normal"/>
     <w:uiPriority w:val="39"/>
     <w:unhideWhenUsed/>
     <w:qFormat/>
-    <w:rsid w:val="00DF5ADD"/>
     <w:pPr>
       <w:spacing w:before="240" w:after="0" w:line="259" w:lineRule="auto"/>
       <w:outlineLvl w:val="9"/>
@@ -3003,14 +4868,12 @@
       <w:szCs w:val="32"/>
     </w:rPr>
   </w:style>
-  <w:style w:type="table" w:styleId="GridTable2-Accent1">
-    <w:name w:val="Grid Table 2 Accent 1"/>
+  <w:style w:type="table" w:customStyle="1" w:styleId="GridTable2-Accent11">
+    <w:name w:val="Grid Table 2 - Accent 11"/>
     <w:basedOn w:val="TableNormal"/>
     <w:uiPriority w:val="47"/>
-    <w:rsid w:val="003969AC"/>
+    <w:qFormat/>
     <w:tblPr>
-      <w:tblStyleRowBandSize w:val="1"/>
-      <w:tblStyleColBandSize w:val="1"/>
       <w:tblBorders>
         <w:top w:val="single" w:sz="2" w:space="0" w:color="8EAADB" w:themeColor="accent1" w:themeTint="99"/>
         <w:bottom w:val="single" w:sz="2" w:space="0" w:color="8EAADB" w:themeColor="accent1" w:themeTint="99"/>
@@ -3075,14 +4938,11 @@
       </w:tcPr>
     </w:tblStylePr>
   </w:style>
-  <w:style w:type="table" w:styleId="GridTable2-Accent5">
-    <w:name w:val="Grid Table 2 Accent 5"/>
+  <w:style w:type="table" w:customStyle="1" w:styleId="GridTable2-Accent51">
+    <w:name w:val="Grid Table 2 - Accent 51"/>
     <w:basedOn w:val="TableNormal"/>
     <w:uiPriority w:val="47"/>
-    <w:rsid w:val="003969AC"/>
     <w:tblPr>
-      <w:tblStyleRowBandSize w:val="1"/>
-      <w:tblStyleColBandSize w:val="1"/>
       <w:tblBorders>
         <w:top w:val="single" w:sz="2" w:space="0" w:color="9CC2E5" w:themeColor="accent5" w:themeTint="99"/>
         <w:bottom w:val="single" w:sz="2" w:space="0" w:color="9CC2E5" w:themeColor="accent5" w:themeTint="99"/>
@@ -3147,11 +5007,11 @@
       </w:tcPr>
     </w:tblStylePr>
   </w:style>
-  <w:style w:type="table" w:styleId="TableGridLight">
-    <w:name w:val="Grid Table Light"/>
+  <w:style w:type="table" w:customStyle="1" w:styleId="TableGridLight1">
+    <w:name w:val="Table Grid Light1"/>
     <w:basedOn w:val="TableNormal"/>
     <w:uiPriority w:val="40"/>
-    <w:rsid w:val="003969AC"/>
+    <w:qFormat/>
     <w:tblPr>
       <w:tblBorders>
         <w:top w:val="single" w:sz="4" w:space="0" w:color="BFBFBF" w:themeColor="background1" w:themeShade="BF"/>
@@ -3426,27 +5286,10 @@
 <b:Sources xmlns:b="http://schemas.openxmlformats.org/officeDocument/2006/bibliography" xmlns="http://schemas.openxmlformats.org/officeDocument/2006/bibliography" SelectedStyle="\APASixthEditionOfficeOnline.xsl" StyleName="APA" Version="6"/>
 </file>
 
-<file path=customXml/item2.xml><?xml version="1.0" encoding="utf-8"?>
-<s:customData xmlns="http://www.wps.cn/officeDocument/2013/wpsCustomData" xmlns:s="http://www.wps.cn/officeDocument/2013/wpsCustomData">
-  <customSectProps/>
-  <customShpExts>
-    <customShpInfo spid="_x0000_s1026" textRotate="1"/>
-  </customShpExts>
-</s:customData>
-</file>
-
 <file path=customXml/itemProps1.xml><?xml version="1.0" encoding="utf-8"?>
 <ds:datastoreItem xmlns:ds="http://schemas.openxmlformats.org/officeDocument/2006/customXml" ds:itemID="{CDE5E590-A2BB-4F3A-8C20-9FFF9B519E04}">
   <ds:schemaRefs>
     <ds:schemaRef ds:uri="http://schemas.openxmlformats.org/officeDocument/2006/bibliography"/>
   </ds:schemaRefs>
 </ds:datastoreItem>
-</file>
-
-<file path=customXml/itemProps2.xml><?xml version="1.0" encoding="utf-8"?>
-<ds:datastoreItem xmlns:ds="http://schemas.openxmlformats.org/officeDocument/2006/customXml" ds:itemID="{B1977F7D-205B-4081-913C-38D41E755F92}">
-  <ds:schemaRefs>
-    <ds:schemaRef ds:uri="http://www.wps.cn/officeDocument/2013/wpsCustomData"/>
-  </ds:schemaRefs>
-</ds:datastoreItem>
 </file>
</xml_diff>